<commit_message>
doc: Adiciona documentação de testes de usabilidade do familiar
</commit_message>
<xml_diff>
--- a/doc/testes/Plano de testes de software - Usabilidade.docx
+++ b/doc/testes/Plano de testes de software - Usabilidade.docx
@@ -1,8 +1,8 @@
 
 <file path=word/document.xml><?xml version="1.0" encoding="utf-8"?>
-<w:document xmlns:wpc="http://schemas.microsoft.com/office/word/2010/wordprocessingCanvas" xmlns:cx="http://schemas.microsoft.com/office/drawing/2014/chartex" xmlns:cx1="http://schemas.microsoft.com/office/drawing/2015/9/8/chartex" xmlns:cx2="http://schemas.microsoft.com/office/drawing/2015/10/21/chartex" xmlns:cx3="http://schemas.microsoft.com/office/drawing/2016/5/9/chartex" xmlns:cx4="http://schemas.microsoft.com/office/drawing/2016/5/10/chartex" xmlns:cx5="http://schemas.microsoft.com/office/drawing/2016/5/11/chartex" xmlns:cx6="http://schemas.microsoft.com/office/drawing/2016/5/12/chartex" xmlns:cx7="http://schemas.microsoft.com/office/drawing/2016/5/13/chartex" xmlns:cx8="http://schemas.microsoft.com/office/drawing/2016/5/14/chartex" xmlns:mc="http://schemas.openxmlformats.org/markup-compatibility/2006" xmlns:aink="http://schemas.microsoft.com/office/drawing/2016/ink" xmlns:am3d="http://schemas.microsoft.com/office/drawing/2017/model3d" xmlns:o="urn:schemas-microsoft-com:office:office" xmlns:r="http://schemas.openxmlformats.org/officeDocument/2006/relationships" xmlns:m="http://schemas.openxmlformats.org/officeDocument/2006/math" xmlns:v="urn:schemas-microsoft-com:vml" xmlns:wp14="http://schemas.microsoft.com/office/word/2010/wordprocessingDrawing" xmlns:wp="http://schemas.openxmlformats.org/drawingml/2006/wordprocessingDrawing" xmlns:w10="urn:schemas-microsoft-com:office:word" xmlns:w="http://schemas.openxmlformats.org/wordprocessingml/2006/main" xmlns:w14="http://schemas.microsoft.com/office/word/2010/wordml" xmlns:w15="http://schemas.microsoft.com/office/word/2012/wordml" xmlns:w16cid="http://schemas.microsoft.com/office/word/2016/wordml/cid" xmlns:w16se="http://schemas.microsoft.com/office/word/2015/wordml/symex" xmlns:wpg="http://schemas.microsoft.com/office/word/2010/wordprocessingGroup" xmlns:wpi="http://schemas.microsoft.com/office/word/2010/wordprocessingInk" xmlns:wne="http://schemas.microsoft.com/office/word/2006/wordml" xmlns:wps="http://schemas.microsoft.com/office/word/2010/wordprocessingShape" xmlns:a="http://schemas.openxmlformats.org/drawingml/2006/main" mc:Ignorable="w14 w15 w16se w16cid wp14">
+<w:document xmlns:wpc="http://schemas.microsoft.com/office/word/2010/wordprocessingCanvas" xmlns:cx="http://schemas.microsoft.com/office/drawing/2014/chartex" xmlns:cx1="http://schemas.microsoft.com/office/drawing/2015/9/8/chartex" xmlns:cx2="http://schemas.microsoft.com/office/drawing/2015/10/21/chartex" xmlns:cx3="http://schemas.microsoft.com/office/drawing/2016/5/9/chartex" xmlns:cx4="http://schemas.microsoft.com/office/drawing/2016/5/10/chartex" xmlns:cx5="http://schemas.microsoft.com/office/drawing/2016/5/11/chartex" xmlns:cx6="http://schemas.microsoft.com/office/drawing/2016/5/12/chartex" xmlns:cx7="http://schemas.microsoft.com/office/drawing/2016/5/13/chartex" xmlns:cx8="http://schemas.microsoft.com/office/drawing/2016/5/14/chartex" xmlns:mc="http://schemas.openxmlformats.org/markup-compatibility/2006" xmlns:aink="http://schemas.microsoft.com/office/drawing/2016/ink" xmlns:am3d="http://schemas.microsoft.com/office/drawing/2017/model3d" xmlns:o="urn:schemas-microsoft-com:office:office" xmlns:r="http://schemas.openxmlformats.org/officeDocument/2006/relationships" xmlns:m="http://schemas.openxmlformats.org/officeDocument/2006/math" xmlns:v="urn:schemas-microsoft-com:vml" xmlns:wp14="http://schemas.microsoft.com/office/word/2010/wordprocessingDrawing" xmlns:wp="http://schemas.openxmlformats.org/drawingml/2006/wordprocessingDrawing" xmlns:w10="urn:schemas-microsoft-com:office:word" xmlns:w="http://schemas.openxmlformats.org/wordprocessingml/2006/main" xmlns:w14="http://schemas.microsoft.com/office/word/2010/wordml" xmlns:w15="http://schemas.microsoft.com/office/word/2012/wordml" xmlns:w16cex="http://schemas.microsoft.com/office/word/2018/wordml/cex" xmlns:w16cid="http://schemas.microsoft.com/office/word/2016/wordml/cid" xmlns:w16="http://schemas.microsoft.com/office/word/2018/wordml" xmlns:w16sdtdh="http://schemas.microsoft.com/office/word/2020/wordml/sdtdatahash" xmlns:w16se="http://schemas.microsoft.com/office/word/2015/wordml/symex" xmlns:wpg="http://schemas.microsoft.com/office/word/2010/wordprocessingGroup" xmlns:wpi="http://schemas.microsoft.com/office/word/2010/wordprocessingInk" xmlns:wne="http://schemas.microsoft.com/office/word/2006/wordml" xmlns:wps="http://schemas.microsoft.com/office/word/2010/wordprocessingShape" mc:Ignorable="w14 w15 w16se w16cid w16 w16cex w16sdtdh wp14">
   <w:body>
-    <w:p xmlns:wp14="http://schemas.microsoft.com/office/word/2010/wordml" wp14:textId="77777777">
+    <w:p>
       <w:pPr>
         <w:jc w:val="center"/>
         <w:rPr>
@@ -25,7 +25,7 @@
         <w:t xml:space="preserve"> </w:t>
       </w:r>
     </w:p>
-    <w:p xmlns:wp14="http://schemas.microsoft.com/office/word/2010/wordml" wp14:textId="77777777">
+    <w:p>
       <w:pPr>
         <w:jc w:val="center"/>
         <w:rPr>
@@ -33,8 +33,6 @@
           <w:sz w:val="36"/>
         </w:rPr>
       </w:pPr>
-      <w:bookmarkStart w:name="_GoBack" w:id="0"/>
-      <w:bookmarkEnd w:id="0"/>
       <w:r>
         <w:rPr>
           <w:b/>
@@ -43,29 +41,29 @@
         <w:t>(Roteiro de Testes)</w:t>
       </w:r>
     </w:p>
-    <w:p xmlns:wp14="http://schemas.microsoft.com/office/word/2010/wordml" wp14:textId="46D0B164">
+    <w:p>
       <w:pPr>
         <w:rPr>
-          <w:b w:val="1"/>
-          <w:bCs w:val="1"/>
+          <w:b/>
+          <w:bCs/>
         </w:rPr>
       </w:pPr>
       <w:r>
         <w:rPr>
-          <w:b w:val="1"/>
-          <w:bCs w:val="1"/>
+          <w:b/>
+          <w:bCs/>
         </w:rPr>
         <w:t xml:space="preserve">1 – </w:t>
       </w:r>
       <w:r>
         <w:rPr>
-          <w:b w:val="1"/>
-          <w:bCs w:val="1"/>
+          <w:b/>
+          <w:bCs/>
         </w:rPr>
         <w:t>Teste de usabilidade psicopedagogo</w:t>
       </w:r>
     </w:p>
-    <w:p xmlns:wp14="http://schemas.microsoft.com/office/word/2010/wordml" wp14:textId="0C379A7B">
+    <w:p>
       <w:pPr>
         <w:rPr>
           <w:sz w:val="20"/>
@@ -103,7 +101,7 @@
         <w:gridCol w:w="1455"/>
         <w:gridCol w:w="1511"/>
       </w:tblGrid>
-      <w:tr xmlns:wp14="http://schemas.microsoft.com/office/word/2010/wordml" wp14:textId="77777777">
+      <w:tr>
         <w:trPr>
           <w:trHeight w:val="342"/>
         </w:trPr>
@@ -111,9 +109,8 @@
           <w:tcPr>
             <w:tcW w:w="1271" w:type="dxa"/>
             <w:shd w:val="clear" w:color="auto" w:fill="4472C4" w:themeFill="accent1"/>
-            <w:tcMar/>
           </w:tcPr>
-          <w:p wp14:textId="77777777">
+          <w:p>
             <w:pPr>
               <w:jc w:val="center"/>
               <w:rPr>
@@ -135,9 +132,8 @@
         <w:tc>
           <w:tcPr>
             <w:tcW w:w="851" w:type="dxa"/>
-            <w:tcMar/>
           </w:tcPr>
-          <w:p wp14:textId="77777777">
+          <w:p>
             <w:pPr>
               <w:rPr>
                 <w:noProof/>
@@ -152,7 +148,7 @@
               <mc:AlternateContent>
                 <mc:Choice Requires="wps">
                   <w:drawing>
-                    <wp:anchor xmlns:wp14="http://schemas.microsoft.com/office/word/2010/wordprocessingDrawing" distT="0" distB="0" distL="114300" distR="114300" simplePos="0" relativeHeight="251679744" behindDoc="0" locked="0" layoutInCell="1" allowOverlap="1" wp14:anchorId="4DEC6299" wp14:editId="008F6120">
+                    <wp:anchor distT="0" distB="0" distL="114300" distR="114300" simplePos="0" relativeHeight="251679744" behindDoc="0" locked="0" layoutInCell="1" allowOverlap="1" wp14:anchorId="4DEC6299" wp14:editId="008F6120">
                       <wp:simplePos x="0" y="0"/>
                       <wp:positionH relativeFrom="column">
                         <wp:posOffset>3175</wp:posOffset>
@@ -217,7 +213,7 @@
                     </wp:anchor>
                   </w:drawing>
                 </mc:Choice>
-                <mc:Fallback>
+                <mc:Fallback xmlns:wp14="http://schemas.microsoft.com/office/word/2010/wordml" xmlns:a="http://schemas.openxmlformats.org/drawingml/2006/main">
                   <w:pict w14:anchorId="47A9943F">
                     <v:rect id="Retângulo 13" style="position:absolute;margin-left:.25pt;margin-top:2.8pt;width:7.95pt;height:8.9pt;z-index:251679744;visibility:visible;mso-wrap-style:square;mso-width-percent:0;mso-height-percent:0;mso-wrap-distance-left:9pt;mso-wrap-distance-top:0;mso-wrap-distance-right:9pt;mso-wrap-distance-bottom:0;mso-position-horizontal:absolute;mso-position-horizontal-relative:text;mso-position-vertical:absolute;mso-position-vertical-relative:text;mso-width-percent:0;mso-height-percent:0;mso-width-relative:margin;mso-height-relative:margin;v-text-anchor:middle" o:spid="_x0000_s1026" fillcolor="#a5a5a5 [2092]" strokecolor="black [1600]" strokeweight="1pt" w14:anchorId="2403656B" o:gfxdata="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"/>
                   </w:pict>
@@ -236,9 +232,8 @@
           <w:tcPr>
             <w:tcW w:w="1984" w:type="dxa"/>
             <w:gridSpan w:val="2"/>
-            <w:tcMar/>
           </w:tcPr>
-          <w:p wp14:textId="77777777">
+          <w:p>
             <w:pPr>
               <w:rPr>
                 <w:noProof/>
@@ -253,7 +248,7 @@
               <mc:AlternateContent>
                 <mc:Choice Requires="wps">
                   <w:drawing>
-                    <wp:anchor xmlns:wp14="http://schemas.microsoft.com/office/word/2010/wordprocessingDrawing" distT="0" distB="0" distL="114300" distR="114300" simplePos="0" relativeHeight="251681792" behindDoc="0" locked="0" layoutInCell="1" allowOverlap="1" wp14:anchorId="6775C25A" wp14:editId="2BADDE8C">
+                    <wp:anchor distT="0" distB="0" distL="114300" distR="114300" simplePos="0" relativeHeight="251681792" behindDoc="0" locked="0" layoutInCell="1" allowOverlap="1" wp14:anchorId="6775C25A" wp14:editId="2BADDE8C">
                       <wp:simplePos x="0" y="0"/>
                       <wp:positionH relativeFrom="column">
                         <wp:posOffset>3175</wp:posOffset>
@@ -316,7 +311,7 @@
                     </wp:anchor>
                   </w:drawing>
                 </mc:Choice>
-                <mc:Fallback>
+                <mc:Fallback xmlns:wp14="http://schemas.microsoft.com/office/word/2010/wordml" xmlns:a="http://schemas.openxmlformats.org/drawingml/2006/main">
                   <w:pict w14:anchorId="34720956">
                     <v:rect id="Retângulo 14" style="position:absolute;margin-left:.25pt;margin-top:2.8pt;width:7.95pt;height:8.9pt;z-index:251681792;visibility:visible;mso-wrap-style:square;mso-width-percent:0;mso-height-percent:0;mso-wrap-distance-left:9pt;mso-wrap-distance-top:0;mso-wrap-distance-right:9pt;mso-wrap-distance-bottom:0;mso-position-horizontal:absolute;mso-position-horizontal-relative:text;mso-position-vertical:absolute;mso-position-vertical-relative:text;mso-width-percent:0;mso-height-percent:0;mso-width-relative:margin;mso-height-relative:margin;v-text-anchor:middle" o:spid="_x0000_s1026" fillcolor="white [3212]" strokecolor="black [1600]" strokeweight="1pt" w14:anchorId="2EEFCA7A" o:gfxdata="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"/>
                   </w:pict>
@@ -335,9 +330,8 @@
           <w:tcPr>
             <w:tcW w:w="5102" w:type="dxa"/>
             <w:gridSpan w:val="4"/>
-            <w:tcMar/>
           </w:tcPr>
-          <w:p wp14:textId="77777777">
+          <w:p>
             <w:pPr>
               <w:rPr>
                 <w:noProof/>
@@ -359,7 +353,7 @@
               <mc:AlternateContent>
                 <mc:Choice Requires="wps">
                   <w:drawing>
-                    <wp:anchor xmlns:wp14="http://schemas.microsoft.com/office/word/2010/wordprocessingDrawing" distT="0" distB="0" distL="114300" distR="114300" simplePos="0" relativeHeight="251683840" behindDoc="0" locked="0" layoutInCell="1" allowOverlap="1" wp14:anchorId="4ADA8A61" wp14:editId="2BADDE8C">
+                    <wp:anchor distT="0" distB="0" distL="114300" distR="114300" simplePos="0" relativeHeight="251683840" behindDoc="0" locked="0" layoutInCell="1" allowOverlap="1" wp14:anchorId="4ADA8A61" wp14:editId="2BADDE8C">
                       <wp:simplePos x="0" y="0"/>
                       <wp:positionH relativeFrom="column">
                         <wp:posOffset>3175</wp:posOffset>
@@ -422,7 +416,7 @@
                     </wp:anchor>
                   </w:drawing>
                 </mc:Choice>
-                <mc:Fallback>
+                <mc:Fallback xmlns:wp14="http://schemas.microsoft.com/office/word/2010/wordml" xmlns:a="http://schemas.openxmlformats.org/drawingml/2006/main">
                   <w:pict w14:anchorId="57B78F74">
                     <v:rect id="Retângulo 15" style="position:absolute;margin-left:.25pt;margin-top:2.8pt;width:7.95pt;height:8.9pt;z-index:251683840;visibility:visible;mso-wrap-style:square;mso-width-percent:0;mso-height-percent:0;mso-wrap-distance-left:9pt;mso-wrap-distance-top:0;mso-wrap-distance-right:9pt;mso-wrap-distance-bottom:0;mso-position-horizontal:absolute;mso-position-horizontal-relative:text;mso-position-vertical:absolute;mso-position-vertical-relative:text;mso-width-percent:0;mso-height-percent:0;mso-width-relative:margin;mso-height-relative:margin;v-text-anchor:middle" o:spid="_x0000_s1026" fillcolor="white [3212]" strokecolor="black [1600]" strokeweight="1pt" w14:anchorId="1E02B9FB" o:gfxdata="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"/>
                   </w:pict>
@@ -439,14 +433,13 @@
           </w:p>
         </w:tc>
       </w:tr>
-      <w:tr xmlns:wp14="http://schemas.microsoft.com/office/word/2010/wordml" wp14:textId="77777777">
+      <w:tr>
         <w:tc>
           <w:tcPr>
             <w:tcW w:w="1271" w:type="dxa"/>
             <w:shd w:val="clear" w:color="auto" w:fill="4472C4" w:themeFill="accent1"/>
-            <w:tcMar/>
           </w:tcPr>
-          <w:p wp14:textId="77777777">
+          <w:p>
             <w:pPr>
               <w:jc w:val="center"/>
               <w:rPr>
@@ -468,17 +461,15 @@
         <w:tc>
           <w:tcPr>
             <w:tcW w:w="851" w:type="dxa"/>
-            <w:tcMar/>
           </w:tcPr>
-          <w:p wp14:textId="77777777"/>
+          <w:p/>
         </w:tc>
         <w:tc>
           <w:tcPr>
             <w:tcW w:w="1656" w:type="dxa"/>
             <w:shd w:val="clear" w:color="auto" w:fill="4472C4" w:themeFill="accent1"/>
-            <w:tcMar/>
           </w:tcPr>
-          <w:p wp14:textId="77777777">
+          <w:p>
             <w:pPr>
               <w:jc w:val="center"/>
               <w:rPr>
@@ -509,9 +500,8 @@
           <w:tcPr>
             <w:tcW w:w="2464" w:type="dxa"/>
             <w:gridSpan w:val="3"/>
-            <w:tcMar/>
           </w:tcPr>
-          <w:p wp14:textId="77777777">
+          <w:p>
             <w:pPr>
               <w:rPr>
                 <w:sz w:val="20"/>
@@ -531,7 +521,7 @@
               <mc:AlternateContent>
                 <mc:Choice Requires="wps">
                   <w:drawing>
-                    <wp:anchor xmlns:wp14="http://schemas.microsoft.com/office/word/2010/wordprocessingDrawing" distT="0" distB="0" distL="114300" distR="114300" simplePos="0" relativeHeight="251659264" behindDoc="0" locked="0" layoutInCell="1" allowOverlap="1" wp14:anchorId="410B716D" wp14:editId="6F0B44AD">
+                    <wp:anchor distT="0" distB="0" distL="114300" distR="114300" simplePos="0" relativeHeight="251659264" behindDoc="0" locked="0" layoutInCell="1" allowOverlap="1" wp14:anchorId="410B716D" wp14:editId="6F0B44AD">
                       <wp:simplePos x="0" y="0"/>
                       <wp:positionH relativeFrom="column">
                         <wp:posOffset>3175</wp:posOffset>
@@ -596,7 +586,7 @@
                     </wp:anchor>
                   </w:drawing>
                 </mc:Choice>
-                <mc:Fallback>
+                <mc:Fallback xmlns:wp14="http://schemas.microsoft.com/office/word/2010/wordml" xmlns:a="http://schemas.openxmlformats.org/drawingml/2006/main">
                   <w:pict w14:anchorId="31840625">
                     <v:rect id="Retângulo 1" style="position:absolute;margin-left:.25pt;margin-top:2.8pt;width:7.95pt;height:8.9pt;z-index:251659264;visibility:visible;mso-wrap-style:square;mso-width-percent:0;mso-height-percent:0;mso-wrap-distance-left:9pt;mso-wrap-distance-top:0;mso-wrap-distance-right:9pt;mso-wrap-distance-bottom:0;mso-position-horizontal:absolute;mso-position-horizontal-relative:text;mso-position-vertical:absolute;mso-position-vertical-relative:text;mso-width-percent:0;mso-height-percent:0;mso-width-relative:margin;mso-height-relative:margin;v-text-anchor:middle" o:spid="_x0000_s1026" fillcolor="#a5a5a5 [2092]" strokecolor="black [1600]" strokeweight="1pt" w14:anchorId="29B2EE5C" o:gfxdata="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"/>
                   </w:pict>
@@ -615,9 +605,8 @@
           <w:tcPr>
             <w:tcW w:w="2966" w:type="dxa"/>
             <w:gridSpan w:val="2"/>
-            <w:tcMar/>
           </w:tcPr>
-          <w:p wp14:textId="77777777">
+          <w:p>
             <w:pPr>
               <w:rPr>
                 <w:sz w:val="20"/>
@@ -631,7 +620,7 @@
               <mc:AlternateContent>
                 <mc:Choice Requires="wps">
                   <w:drawing>
-                    <wp:anchor xmlns:wp14="http://schemas.microsoft.com/office/word/2010/wordprocessingDrawing" distT="0" distB="0" distL="114300" distR="114300" simplePos="0" relativeHeight="251661312" behindDoc="0" locked="0" layoutInCell="1" allowOverlap="1" wp14:anchorId="0F76D4B3" wp14:editId="6F0B44AD">
+                    <wp:anchor distT="0" distB="0" distL="114300" distR="114300" simplePos="0" relativeHeight="251661312" behindDoc="0" locked="0" layoutInCell="1" allowOverlap="1" wp14:anchorId="0F76D4B3" wp14:editId="6F0B44AD">
                       <wp:simplePos x="0" y="0"/>
                       <wp:positionH relativeFrom="column">
                         <wp:posOffset>3175</wp:posOffset>
@@ -694,7 +683,7 @@
                     </wp:anchor>
                   </w:drawing>
                 </mc:Choice>
-                <mc:Fallback>
+                <mc:Fallback xmlns:wp14="http://schemas.microsoft.com/office/word/2010/wordml" xmlns:a="http://schemas.openxmlformats.org/drawingml/2006/main">
                   <w:pict w14:anchorId="3BD608C7">
                     <v:rect id="Retângulo 2" style="position:absolute;margin-left:.25pt;margin-top:2.8pt;width:7.95pt;height:8.9pt;z-index:251661312;visibility:visible;mso-wrap-style:square;mso-width-percent:0;mso-height-percent:0;mso-wrap-distance-left:9pt;mso-wrap-distance-top:0;mso-wrap-distance-right:9pt;mso-wrap-distance-bottom:0;mso-position-horizontal:absolute;mso-position-horizontal-relative:text;mso-position-vertical:absolute;mso-position-vertical-relative:text;mso-width-percent:0;mso-height-percent:0;mso-width-relative:margin;mso-height-relative:margin;v-text-anchor:middle" o:spid="_x0000_s1026" fillcolor="white [3212]" strokecolor="black [1600]" strokeweight="1pt" w14:anchorId="6F5018EA" o:gfxdata="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"/>
                   </w:pict>
@@ -722,15 +711,14 @@
           </w:p>
         </w:tc>
       </w:tr>
-      <w:tr xmlns:wp14="http://schemas.microsoft.com/office/word/2010/wordml" wp14:textId="77777777">
+      <w:tr>
         <w:tc>
           <w:tcPr>
             <w:tcW w:w="1271" w:type="dxa"/>
             <w:shd w:val="clear" w:color="auto" w:fill="4472C4" w:themeFill="accent1"/>
-            <w:tcMar/>
             <w:vAlign w:val="center"/>
           </w:tcPr>
-          <w:p wp14:textId="77777777">
+          <w:p>
             <w:pPr>
               <w:jc w:val="center"/>
               <w:rPr>
@@ -752,9 +740,8 @@
         <w:tc>
           <w:tcPr>
             <w:tcW w:w="851" w:type="dxa"/>
-            <w:tcMar/>
           </w:tcPr>
-          <w:p wp14:textId="77777777">
+          <w:p>
             <w:pPr>
               <w:rPr>
                 <w:b/>
@@ -778,9 +765,8 @@
           <w:tcPr>
             <w:tcW w:w="1656" w:type="dxa"/>
             <w:shd w:val="clear" w:color="auto" w:fill="4472C4" w:themeFill="accent1"/>
-            <w:tcMar/>
           </w:tcPr>
-          <w:p wp14:textId="77777777">
+          <w:p>
             <w:pPr>
               <w:jc w:val="center"/>
               <w:rPr>
@@ -803,9 +789,8 @@
           <w:tcPr>
             <w:tcW w:w="1167" w:type="dxa"/>
             <w:gridSpan w:val="2"/>
-            <w:tcMar/>
           </w:tcPr>
-          <w:p wp14:textId="77777777">
+          <w:p>
             <w:pPr>
               <w:rPr>
                 <w:sz w:val="20"/>
@@ -818,7 +803,7 @@
               <w:t>Usabilidade</w:t>
             </w:r>
           </w:p>
-          <w:p wp14:textId="77777777">
+          <w:p>
             <w:pPr>
               <w:rPr>
                 <w:sz w:val="20"/>
@@ -832,7 +817,7 @@
               <mc:AlternateContent>
                 <mc:Choice Requires="wps">
                   <w:drawing>
-                    <wp:anchor xmlns:wp14="http://schemas.microsoft.com/office/word/2010/wordprocessingDrawing" distT="0" distB="0" distL="114300" distR="114300" simplePos="0" relativeHeight="251665408" behindDoc="0" locked="0" layoutInCell="1" allowOverlap="1" wp14:anchorId="483F6F21" wp14:editId="44971C6E">
+                    <wp:anchor distT="0" distB="0" distL="114300" distR="114300" simplePos="0" relativeHeight="251665408" behindDoc="0" locked="0" layoutInCell="1" allowOverlap="1" wp14:anchorId="483F6F21" wp14:editId="44971C6E">
                       <wp:simplePos x="0" y="0"/>
                       <wp:positionH relativeFrom="column">
                         <wp:posOffset>283738</wp:posOffset>
@@ -897,7 +882,7 @@
                     </wp:anchor>
                   </w:drawing>
                 </mc:Choice>
-                <mc:Fallback>
+                <mc:Fallback xmlns:wp14="http://schemas.microsoft.com/office/word/2010/wordml" xmlns:a="http://schemas.openxmlformats.org/drawingml/2006/main">
                   <w:pict w14:anchorId="74C6D5CB">
                     <v:rect id="Retângulo 4" style="position:absolute;margin-left:22.35pt;margin-top:1.2pt;width:7.95pt;height:8.9pt;z-index:251665408;visibility:visible;mso-wrap-style:square;mso-width-percent:0;mso-height-percent:0;mso-wrap-distance-left:9pt;mso-wrap-distance-top:0;mso-wrap-distance-right:9pt;mso-wrap-distance-bottom:0;mso-position-horizontal:absolute;mso-position-horizontal-relative:text;mso-position-vertical:absolute;mso-position-vertical-relative:text;mso-width-percent:0;mso-height-percent:0;mso-width-relative:margin;mso-height-relative:margin;v-text-anchor:middle" o:spid="_x0000_s1026" fillcolor="#a5a5a5 [2092]" strokecolor="black [1600]" strokeweight="1pt" w14:anchorId="493FC761" o:gfxdata="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"/>
                   </w:pict>
@@ -909,9 +894,8 @@
         <w:tc>
           <w:tcPr>
             <w:tcW w:w="1297" w:type="dxa"/>
-            <w:tcMar/>
           </w:tcPr>
-          <w:p wp14:textId="77777777">
+          <w:p>
             <w:pPr>
               <w:rPr>
                 <w:sz w:val="20"/>
@@ -924,7 +908,7 @@
               <w:t>Desempenho</w:t>
             </w:r>
           </w:p>
-          <w:p wp14:textId="77777777">
+          <w:p>
             <w:pPr>
               <w:rPr>
                 <w:sz w:val="20"/>
@@ -938,7 +922,7 @@
               <mc:AlternateContent>
                 <mc:Choice Requires="wps">
                   <w:drawing>
-                    <wp:anchor xmlns:wp14="http://schemas.microsoft.com/office/word/2010/wordprocessingDrawing" distT="0" distB="0" distL="114300" distR="114300" simplePos="0" relativeHeight="251667456" behindDoc="0" locked="0" layoutInCell="1" allowOverlap="1" wp14:anchorId="3818ADAF" wp14:editId="25CBD915">
+                    <wp:anchor distT="0" distB="0" distL="114300" distR="114300" simplePos="0" relativeHeight="251667456" behindDoc="0" locked="0" layoutInCell="1" allowOverlap="1" wp14:anchorId="3818ADAF" wp14:editId="25CBD915">
                       <wp:simplePos x="0" y="0"/>
                       <wp:positionH relativeFrom="column">
                         <wp:posOffset>343749</wp:posOffset>
@@ -1001,7 +985,7 @@
                     </wp:anchor>
                   </w:drawing>
                 </mc:Choice>
-                <mc:Fallback>
+                <mc:Fallback xmlns:wp14="http://schemas.microsoft.com/office/word/2010/wordml" xmlns:a="http://schemas.openxmlformats.org/drawingml/2006/main">
                   <w:pict w14:anchorId="5EF845F6">
                     <v:rect id="Retângulo 3" style="position:absolute;margin-left:27.05pt;margin-top:1.2pt;width:7.95pt;height:8.9pt;z-index:251667456;visibility:visible;mso-wrap-style:square;mso-width-percent:0;mso-height-percent:0;mso-wrap-distance-left:9pt;mso-wrap-distance-top:0;mso-wrap-distance-right:9pt;mso-wrap-distance-bottom:0;mso-position-horizontal:absolute;mso-position-horizontal-relative:text;mso-position-vertical:absolute;mso-position-vertical-relative:text;mso-width-percent:0;mso-height-percent:0;mso-width-relative:margin;mso-height-relative:margin;v-text-anchor:middle" o:spid="_x0000_s1026" fillcolor="white [3212]" strokecolor="black [1600]" strokeweight="1pt" w14:anchorId="092BD358" o:gfxdata="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"/>
                   </w:pict>
@@ -1013,9 +997,8 @@
         <w:tc>
           <w:tcPr>
             <w:tcW w:w="1455" w:type="dxa"/>
-            <w:tcMar/>
           </w:tcPr>
-          <w:p wp14:textId="77777777">
+          <w:p>
             <w:pPr>
               <w:rPr>
                 <w:sz w:val="20"/>
@@ -1028,7 +1011,7 @@
               <w:t>Funcionalidade</w:t>
             </w:r>
           </w:p>
-          <w:p wp14:textId="77777777">
+          <w:p>
             <w:pPr>
               <w:rPr>
                 <w:sz w:val="20"/>
@@ -1042,7 +1025,7 @@
               <mc:AlternateContent>
                 <mc:Choice Requires="wps">
                   <w:drawing>
-                    <wp:anchor xmlns:wp14="http://schemas.microsoft.com/office/word/2010/wordprocessingDrawing" distT="0" distB="0" distL="114300" distR="114300" simplePos="0" relativeHeight="251669504" behindDoc="0" locked="0" layoutInCell="1" allowOverlap="1" wp14:anchorId="5E4444E3" wp14:editId="25CBD915">
+                    <wp:anchor distT="0" distB="0" distL="114300" distR="114300" simplePos="0" relativeHeight="251669504" behindDoc="0" locked="0" layoutInCell="1" allowOverlap="1" wp14:anchorId="5E4444E3" wp14:editId="25CBD915">
                       <wp:simplePos x="0" y="0"/>
                       <wp:positionH relativeFrom="column">
                         <wp:posOffset>343749</wp:posOffset>
@@ -1105,7 +1088,7 @@
                     </wp:anchor>
                   </w:drawing>
                 </mc:Choice>
-                <mc:Fallback>
+                <mc:Fallback xmlns:wp14="http://schemas.microsoft.com/office/word/2010/wordml" xmlns:a="http://schemas.openxmlformats.org/drawingml/2006/main">
                   <w:pict w14:anchorId="46299F90">
                     <v:rect id="Retângulo 5" style="position:absolute;margin-left:27.05pt;margin-top:1.2pt;width:7.95pt;height:8.9pt;z-index:251669504;visibility:visible;mso-wrap-style:square;mso-width-percent:0;mso-height-percent:0;mso-wrap-distance-left:9pt;mso-wrap-distance-top:0;mso-wrap-distance-right:9pt;mso-wrap-distance-bottom:0;mso-position-horizontal:absolute;mso-position-horizontal-relative:text;mso-position-vertical:absolute;mso-position-vertical-relative:text;mso-width-percent:0;mso-height-percent:0;mso-width-relative:margin;mso-height-relative:margin;v-text-anchor:middle" o:spid="_x0000_s1026" fillcolor="white [3212]" strokecolor="black [1600]" strokeweight="1pt" w14:anchorId="502290F4" o:gfxdata="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"/>
                   </w:pict>
@@ -1117,9 +1100,8 @@
         <w:tc>
           <w:tcPr>
             <w:tcW w:w="1511" w:type="dxa"/>
-            <w:tcMar/>
           </w:tcPr>
-          <w:p wp14:textId="77777777">
+          <w:p>
             <w:pPr>
               <w:rPr>
                 <w:sz w:val="20"/>
@@ -1134,14 +1116,13 @@
           </w:p>
         </w:tc>
       </w:tr>
-      <w:tr xmlns:wp14="http://schemas.microsoft.com/office/word/2010/wordml" wp14:textId="77777777">
+      <w:tr>
         <w:tc>
           <w:tcPr>
             <w:tcW w:w="1271" w:type="dxa"/>
             <w:shd w:val="clear" w:color="auto" w:fill="4472C4" w:themeFill="accent1"/>
-            <w:tcMar/>
           </w:tcPr>
-          <w:p wp14:textId="77777777">
+          <w:p>
             <w:pPr>
               <w:jc w:val="center"/>
               <w:rPr>
@@ -1164,24 +1145,21 @@
           <w:tcPr>
             <w:tcW w:w="7937" w:type="dxa"/>
             <w:gridSpan w:val="7"/>
-            <w:tcMar/>
           </w:tcPr>
-          <w:p wp14:textId="13CD38B7">
-            <w:r>
-              <w:rPr/>
+          <w:p>
+            <w:r>
               <w:t>Realizar um teste de campo da aplicação com personas reais (Caixa preta)</w:t>
             </w:r>
           </w:p>
         </w:tc>
       </w:tr>
-      <w:tr xmlns:wp14="http://schemas.microsoft.com/office/word/2010/wordml" wp14:textId="77777777">
+      <w:tr>
         <w:tc>
           <w:tcPr>
             <w:tcW w:w="1271" w:type="dxa"/>
             <w:shd w:val="clear" w:color="auto" w:fill="4472C4" w:themeFill="accent1"/>
-            <w:tcMar/>
           </w:tcPr>
-          <w:p wp14:textId="77777777">
+          <w:p>
             <w:pPr>
               <w:jc w:val="center"/>
               <w:rPr>
@@ -1228,30 +1206,26 @@
           <w:tcPr>
             <w:tcW w:w="7937" w:type="dxa"/>
             <w:gridSpan w:val="7"/>
-            <w:tcMar/>
           </w:tcPr>
-          <w:p wp14:textId="67B5E4FA">
-            <w:r>
-              <w:rPr/>
+          <w:p>
+            <w:r>
               <w:t>Comprovar a disponibilidade, usabilidade e escalabilidade d</w:t>
             </w:r>
             <w:r>
-              <w:rPr/>
               <w:t>a aplicação</w:t>
             </w:r>
           </w:p>
         </w:tc>
       </w:tr>
-      <w:tr xmlns:wp14="http://schemas.microsoft.com/office/word/2010/wordml" wp14:textId="77777777">
+      <w:tr>
         <w:trPr>
           <w:trHeight w:val="1698"/>
         </w:trPr>
         <w:tc>
           <w:tcPr>
             <w:tcW w:w="1271" w:type="dxa"/>
-            <w:tcMar/>
           </w:tcPr>
-          <w:p wp14:textId="77777777">
+          <w:p>
             <w:pPr>
               <w:rPr>
                 <w:b/>
@@ -1263,7 +1237,6 @@
           <w:tcPr>
             <w:tcW w:w="7937" w:type="dxa"/>
             <w:gridSpan w:val="7"/>
-            <w:tcMar/>
           </w:tcPr>
           <w:tbl>
             <w:tblPr>
@@ -1278,15 +1251,14 @@
               <w:gridCol w:w="3222"/>
               <w:gridCol w:w="3402"/>
             </w:tblGrid>
-            <w:tr wp14:textId="77777777">
+            <w:tr>
               <w:tc>
                 <w:tcPr>
                   <w:tcW w:w="742" w:type="dxa"/>
                   <w:shd w:val="clear" w:color="auto" w:fill="000000" w:themeFill="text1"/>
-                  <w:tcMar/>
                   <w:vAlign w:val="center"/>
                 </w:tcPr>
-                <w:p wp14:textId="77777777">
+                <w:p>
                   <w:pPr>
                     <w:jc w:val="center"/>
                     <w:rPr>
@@ -1307,10 +1279,9 @@
                 <w:tcPr>
                   <w:tcW w:w="3222" w:type="dxa"/>
                   <w:shd w:val="clear" w:color="auto" w:fill="000000" w:themeFill="text1"/>
-                  <w:tcMar/>
                   <w:vAlign w:val="center"/>
                 </w:tcPr>
-                <w:p wp14:textId="77777777">
+                <w:p>
                   <w:pPr>
                     <w:jc w:val="center"/>
                     <w:rPr>
@@ -1331,10 +1302,9 @@
                 <w:tcPr>
                   <w:tcW w:w="3402" w:type="dxa"/>
                   <w:shd w:val="clear" w:color="auto" w:fill="000000" w:themeFill="text1"/>
-                  <w:tcMar/>
                   <w:vAlign w:val="center"/>
                 </w:tcPr>
-                <w:p wp14:textId="77777777">
+                <w:p>
                   <w:pPr>
                     <w:jc w:val="center"/>
                     <w:rPr>
@@ -1366,14 +1336,13 @@
                 </w:p>
               </w:tc>
             </w:tr>
-            <w:tr wp14:textId="77777777">
+            <w:tr>
               <w:tc>
                 <w:tcPr>
                   <w:tcW w:w="742" w:type="dxa"/>
-                  <w:tcMar/>
                   <w:vAlign w:val="center"/>
                 </w:tcPr>
-                <w:p wp14:textId="664D4146">
+                <w:p>
                   <w:pPr>
                     <w:jc w:val="center"/>
                     <w:rPr>
@@ -1393,32 +1362,22 @@
               <w:tc>
                 <w:tcPr>
                   <w:tcW w:w="3222" w:type="dxa"/>
-                  <w:tcMar/>
                   <w:vAlign w:val="center"/>
                 </w:tcPr>
                 <w:p>
                   <w:pPr>
-                    <w:pStyle w:val="ListParagraph"/>
-                    <w:ind w:left="720"/>
-                    <w:jc w:val="left"/>
-                    <w:rPr>
-                      <w:sz w:val="20"/>
-                      <w:szCs w:val="20"/>
-                    </w:rPr>
-                  </w:pPr>
-                  <w:r>
-                    <w:rPr>
-                      <w:sz w:val="20"/>
-                      <w:szCs w:val="20"/>
-                    </w:rPr>
-                    <w:t xml:space="preserve">O </w:t>
-                  </w:r>
-                  <w:r>
-                    <w:rPr>
-                      <w:sz w:val="20"/>
-                      <w:szCs w:val="20"/>
-                    </w:rPr>
-                    <w:t>tester</w:t>
+                    <w:pStyle w:val="PargrafodaLista"/>
+                    <w:rPr>
+                      <w:sz w:val="20"/>
+                      <w:szCs w:val="20"/>
+                    </w:rPr>
+                  </w:pPr>
+                  <w:r>
+                    <w:rPr>
+                      <w:sz w:val="20"/>
+                      <w:szCs w:val="20"/>
+                    </w:rPr>
+                    <w:t>O tester</w:t>
                   </w:r>
                   <w:r>
                     <w:rPr>
@@ -1430,23 +1389,20 @@
                 </w:p>
                 <w:p>
                   <w:pPr>
-                    <w:pStyle w:val="ListParagraph"/>
-                    <w:ind w:left="720"/>
-                    <w:jc w:val="left"/>
-                    <w:rPr>
-                      <w:sz w:val="20"/>
-                      <w:szCs w:val="20"/>
-                    </w:rPr>
-                  </w:pPr>
-                </w:p>
-                <w:p wp14:textId="6E4E7E43">
-                  <w:pPr>
-                    <w:pStyle w:val="ListParagraph"/>
+                    <w:pStyle w:val="PargrafodaLista"/>
+                    <w:rPr>
+                      <w:sz w:val="20"/>
+                      <w:szCs w:val="20"/>
+                    </w:rPr>
+                  </w:pPr>
+                </w:p>
+                <w:p>
+                  <w:pPr>
+                    <w:pStyle w:val="PargrafodaLista"/>
                     <w:numPr>
                       <w:ilvl w:val="0"/>
                       <w:numId w:val="1"/>
                     </w:numPr>
-                    <w:jc w:val="left"/>
                     <w:rPr>
                       <w:sz w:val="20"/>
                       <w:szCs w:val="20"/>
@@ -1460,25 +1416,22 @@
                     <w:t>Faça o login como psicopedagogo</w:t>
                   </w:r>
                 </w:p>
-                <w:p wp14:textId="3831D56D">
-                  <w:pPr>
-                    <w:pStyle w:val="ListParagraph"/>
-                    <w:ind w:left="720"/>
-                    <w:jc w:val="left"/>
-                    <w:rPr>
-                      <w:sz w:val="20"/>
-                      <w:szCs w:val="20"/>
-                    </w:rPr>
-                  </w:pPr>
-                </w:p>
-                <w:p wp14:textId="5E5269B7">
-                  <w:pPr>
-                    <w:pStyle w:val="ListParagraph"/>
+                <w:p>
+                  <w:pPr>
+                    <w:pStyle w:val="PargrafodaLista"/>
+                    <w:rPr>
+                      <w:sz w:val="20"/>
+                      <w:szCs w:val="20"/>
+                    </w:rPr>
+                  </w:pPr>
+                </w:p>
+                <w:p>
+                  <w:pPr>
+                    <w:pStyle w:val="PargrafodaLista"/>
                     <w:numPr>
                       <w:ilvl w:val="0"/>
                       <w:numId w:val="1"/>
                     </w:numPr>
-                    <w:jc w:val="left"/>
                     <w:rPr>
                       <w:sz w:val="20"/>
                       <w:szCs w:val="20"/>
@@ -1499,25 +1452,22 @@
                     <w:t>ze a adição de um paciente com o número de registro: 26040001</w:t>
                   </w:r>
                 </w:p>
-                <w:p wp14:textId="09B90450">
-                  <w:pPr>
-                    <w:pStyle w:val="ListParagraph"/>
-                    <w:ind w:left="720"/>
-                    <w:jc w:val="left"/>
-                    <w:rPr>
-                      <w:sz w:val="20"/>
-                      <w:szCs w:val="20"/>
-                    </w:rPr>
-                  </w:pPr>
-                </w:p>
-                <w:p wp14:textId="14E479D1">
-                  <w:pPr>
-                    <w:pStyle w:val="ListParagraph"/>
+                <w:p>
+                  <w:pPr>
+                    <w:pStyle w:val="PargrafodaLista"/>
+                    <w:rPr>
+                      <w:sz w:val="20"/>
+                      <w:szCs w:val="20"/>
+                    </w:rPr>
+                  </w:pPr>
+                </w:p>
+                <w:p>
+                  <w:pPr>
+                    <w:pStyle w:val="PargrafodaLista"/>
                     <w:numPr>
                       <w:ilvl w:val="0"/>
                       <w:numId w:val="1"/>
                     </w:numPr>
-                    <w:jc w:val="left"/>
                     <w:rPr>
                       <w:sz w:val="20"/>
                       <w:szCs w:val="20"/>
@@ -1531,25 +1481,22 @@
                     <w:t>Preencha parte da avaliação comportamental do paciente.</w:t>
                   </w:r>
                 </w:p>
-                <w:p wp14:textId="2D628982">
-                  <w:pPr>
-                    <w:pStyle w:val="ListParagraph"/>
-                    <w:ind w:left="720"/>
-                    <w:jc w:val="left"/>
-                    <w:rPr>
-                      <w:sz w:val="20"/>
-                      <w:szCs w:val="20"/>
-                    </w:rPr>
-                  </w:pPr>
-                </w:p>
-                <w:p wp14:textId="24E37C71">
-                  <w:pPr>
-                    <w:pStyle w:val="ListParagraph"/>
+                <w:p>
+                  <w:pPr>
+                    <w:pStyle w:val="PargrafodaLista"/>
+                    <w:rPr>
+                      <w:sz w:val="20"/>
+                      <w:szCs w:val="20"/>
+                    </w:rPr>
+                  </w:pPr>
+                </w:p>
+                <w:p>
+                  <w:pPr>
+                    <w:pStyle w:val="PargrafodaLista"/>
                     <w:numPr>
                       <w:ilvl w:val="0"/>
                       <w:numId w:val="1"/>
                     </w:numPr>
-                    <w:jc w:val="left"/>
                     <w:rPr>
                       <w:sz w:val="20"/>
                       <w:szCs w:val="20"/>
@@ -1563,43 +1510,33 @@
                     <w:t>Acesse o perfil de paciente.</w:t>
                   </w:r>
                 </w:p>
-                <w:p wp14:textId="1C827E1B">
-                  <w:pPr>
-                    <w:pStyle w:val="ListParagraph"/>
-                    <w:ind w:left="720"/>
-                    <w:jc w:val="left"/>
-                    <w:rPr>
-                      <w:sz w:val="20"/>
-                      <w:szCs w:val="20"/>
-                    </w:rPr>
-                  </w:pPr>
-                </w:p>
-                <w:p wp14:textId="201AA6F0">
-                  <w:pPr>
-                    <w:pStyle w:val="ListParagraph"/>
+                <w:p>
+                  <w:pPr>
+                    <w:pStyle w:val="PargrafodaLista"/>
+                    <w:rPr>
+                      <w:sz w:val="20"/>
+                      <w:szCs w:val="20"/>
+                    </w:rPr>
+                  </w:pPr>
+                </w:p>
+                <w:p>
+                  <w:pPr>
+                    <w:pStyle w:val="PargrafodaLista"/>
                     <w:numPr>
                       <w:ilvl w:val="0"/>
                       <w:numId w:val="1"/>
                     </w:numPr>
-                    <w:jc w:val="left"/>
-                    <w:rPr>
-                      <w:sz w:val="20"/>
-                      <w:szCs w:val="20"/>
-                    </w:rPr>
-                  </w:pPr>
-                  <w:r>
-                    <w:rPr>
-                      <w:sz w:val="20"/>
-                      <w:szCs w:val="20"/>
-                    </w:rPr>
-                    <w:t xml:space="preserve">Entre em um </w:t>
-                  </w:r>
-                  <w:r>
-                    <w:rPr>
-                      <w:sz w:val="20"/>
-                      <w:szCs w:val="20"/>
-                    </w:rPr>
-                    <w:t>dos campo</w:t>
+                    <w:rPr>
+                      <w:sz w:val="20"/>
+                      <w:szCs w:val="20"/>
+                    </w:rPr>
+                  </w:pPr>
+                  <w:r>
+                    <w:rPr>
+                      <w:sz w:val="20"/>
+                      <w:szCs w:val="20"/>
+                    </w:rPr>
+                    <w:t>Entre em um dos campo</w:t>
                   </w:r>
                   <w:r>
                     <w:rPr>
@@ -1616,25 +1553,22 @@
                     <w:t xml:space="preserve"> de habilidade.</w:t>
                   </w:r>
                 </w:p>
-                <w:p wp14:textId="0CE09576">
-                  <w:pPr>
-                    <w:pStyle w:val="ListParagraph"/>
-                    <w:ind w:left="720"/>
-                    <w:jc w:val="left"/>
-                    <w:rPr>
-                      <w:sz w:val="20"/>
-                      <w:szCs w:val="20"/>
-                    </w:rPr>
-                  </w:pPr>
-                </w:p>
-                <w:p wp14:textId="60CB31A7">
-                  <w:pPr>
-                    <w:pStyle w:val="ListParagraph"/>
+                <w:p>
+                  <w:pPr>
+                    <w:pStyle w:val="PargrafodaLista"/>
+                    <w:rPr>
+                      <w:sz w:val="20"/>
+                      <w:szCs w:val="20"/>
+                    </w:rPr>
+                  </w:pPr>
+                </w:p>
+                <w:p>
+                  <w:pPr>
+                    <w:pStyle w:val="PargrafodaLista"/>
                     <w:numPr>
                       <w:ilvl w:val="0"/>
                       <w:numId w:val="1"/>
                     </w:numPr>
-                    <w:jc w:val="left"/>
                     <w:rPr>
                       <w:sz w:val="20"/>
                       <w:szCs w:val="20"/>
@@ -1648,25 +1582,22 @@
                     <w:t>Realize o cadastro de uma atividade pré-definida.</w:t>
                   </w:r>
                 </w:p>
-                <w:p wp14:textId="79196133">
-                  <w:pPr>
-                    <w:pStyle w:val="ListParagraph"/>
-                    <w:ind w:left="720"/>
-                    <w:jc w:val="left"/>
-                    <w:rPr>
-                      <w:sz w:val="20"/>
-                      <w:szCs w:val="20"/>
-                    </w:rPr>
-                  </w:pPr>
-                </w:p>
-                <w:p wp14:textId="460E856D">
-                  <w:pPr>
-                    <w:pStyle w:val="ListParagraph"/>
+                <w:p>
+                  <w:pPr>
+                    <w:pStyle w:val="PargrafodaLista"/>
+                    <w:rPr>
+                      <w:sz w:val="20"/>
+                      <w:szCs w:val="20"/>
+                    </w:rPr>
+                  </w:pPr>
+                </w:p>
+                <w:p>
+                  <w:pPr>
+                    <w:pStyle w:val="PargrafodaLista"/>
                     <w:numPr>
                       <w:ilvl w:val="0"/>
                       <w:numId w:val="1"/>
                     </w:numPr>
-                    <w:jc w:val="left"/>
                     <w:rPr>
                       <w:sz w:val="20"/>
                       <w:szCs w:val="20"/>
@@ -1680,25 +1611,22 @@
                     <w:t>Realize o cadastro de uma atividade personalizada.</w:t>
                   </w:r>
                 </w:p>
-                <w:p wp14:textId="454259EB">
-                  <w:pPr>
-                    <w:pStyle w:val="ListParagraph"/>
-                    <w:ind w:left="720"/>
-                    <w:jc w:val="left"/>
-                    <w:rPr>
-                      <w:sz w:val="20"/>
-                      <w:szCs w:val="20"/>
-                    </w:rPr>
-                  </w:pPr>
-                </w:p>
-                <w:p wp14:textId="679125EB">
-                  <w:pPr>
-                    <w:pStyle w:val="ListParagraph"/>
+                <w:p>
+                  <w:pPr>
+                    <w:pStyle w:val="PargrafodaLista"/>
+                    <w:rPr>
+                      <w:sz w:val="20"/>
+                      <w:szCs w:val="20"/>
+                    </w:rPr>
+                  </w:pPr>
+                </w:p>
+                <w:p>
+                  <w:pPr>
+                    <w:pStyle w:val="PargrafodaLista"/>
                     <w:numPr>
                       <w:ilvl w:val="0"/>
                       <w:numId w:val="1"/>
                     </w:numPr>
-                    <w:jc w:val="left"/>
                     <w:rPr>
                       <w:sz w:val="20"/>
                       <w:szCs w:val="20"/>
@@ -1719,25 +1647,22 @@
                     <w:t>das atividades recém cadastradas.</w:t>
                   </w:r>
                 </w:p>
-                <w:p wp14:textId="4B885F73">
-                  <w:pPr>
-                    <w:pStyle w:val="ListParagraph"/>
-                    <w:ind w:left="720"/>
-                    <w:jc w:val="left"/>
-                    <w:rPr>
-                      <w:sz w:val="20"/>
-                      <w:szCs w:val="20"/>
-                    </w:rPr>
-                  </w:pPr>
-                </w:p>
-                <w:p wp14:textId="7431DB17">
-                  <w:pPr>
-                    <w:pStyle w:val="ListParagraph"/>
+                <w:p>
+                  <w:pPr>
+                    <w:pStyle w:val="PargrafodaLista"/>
+                    <w:rPr>
+                      <w:sz w:val="20"/>
+                      <w:szCs w:val="20"/>
+                    </w:rPr>
+                  </w:pPr>
+                </w:p>
+                <w:p>
+                  <w:pPr>
+                    <w:pStyle w:val="PargrafodaLista"/>
                     <w:numPr>
                       <w:ilvl w:val="0"/>
                       <w:numId w:val="1"/>
                     </w:numPr>
-                    <w:jc w:val="left"/>
                     <w:rPr>
                       <w:sz w:val="20"/>
                       <w:szCs w:val="20"/>
@@ -1758,43 +1683,39 @@
                     <w:t>que foram cadastradas.</w:t>
                   </w:r>
                 </w:p>
-                <w:p wp14:textId="02B80209">
-                  <w:pPr>
-                    <w:pStyle w:val="ListParagraph"/>
-                    <w:ind w:left="720"/>
-                    <w:jc w:val="left"/>
-                    <w:rPr>
-                      <w:sz w:val="20"/>
-                      <w:szCs w:val="20"/>
-                    </w:rPr>
-                  </w:pPr>
-                </w:p>
-                <w:p wp14:textId="6A3CEC35">
-                  <w:pPr>
-                    <w:pStyle w:val="ListParagraph"/>
+                <w:p>
+                  <w:pPr>
+                    <w:pStyle w:val="PargrafodaLista"/>
+                    <w:rPr>
+                      <w:sz w:val="20"/>
+                      <w:szCs w:val="20"/>
+                    </w:rPr>
+                  </w:pPr>
+                </w:p>
+                <w:p>
+                  <w:pPr>
+                    <w:pStyle w:val="PargrafodaLista"/>
                     <w:numPr>
                       <w:ilvl w:val="0"/>
                       <w:numId w:val="1"/>
                     </w:numPr>
-                    <w:jc w:val="left"/>
-                    <w:rPr>
-                      <w:sz w:val="20"/>
-                      <w:szCs w:val="20"/>
-                    </w:rPr>
-                  </w:pPr>
-                  <w:r>
-                    <w:rPr>
-                      <w:sz w:val="20"/>
-                      <w:szCs w:val="20"/>
-                    </w:rPr>
+                    <w:rPr>
+                      <w:sz w:val="20"/>
+                      <w:szCs w:val="20"/>
+                    </w:rPr>
+                  </w:pPr>
+                  <w:r>
+                    <w:rPr>
+                      <w:sz w:val="20"/>
+                      <w:szCs w:val="20"/>
+                    </w:rPr>
+                    <w:lastRenderedPageBreak/>
                     <w:t xml:space="preserve">Veja detalhes das </w:t>
                   </w:r>
                 </w:p>
-                <w:p wp14:textId="705BE7E5">
-                  <w:pPr>
-                    <w:pStyle w:val="ListParagraph"/>
-                    <w:ind w:left="720"/>
-                    <w:jc w:val="left"/>
+                <w:p>
+                  <w:pPr>
+                    <w:pStyle w:val="PargrafodaLista"/>
                     <w:rPr>
                       <w:sz w:val="20"/>
                       <w:szCs w:val="20"/>
@@ -1808,11 +1729,9 @@
                     <w:t>tentativas feitas.</w:t>
                   </w:r>
                 </w:p>
-                <w:p wp14:textId="456BB46E">
-                  <w:pPr>
-                    <w:pStyle w:val="ListParagraph"/>
-                    <w:ind w:left="720"/>
-                    <w:jc w:val="left"/>
+                <w:p>
+                  <w:pPr>
+                    <w:pStyle w:val="PargrafodaLista"/>
                     <w:rPr>
                       <w:sz w:val="20"/>
                       <w:szCs w:val="20"/>
@@ -1826,14 +1745,13 @@
                     <w:t xml:space="preserve">  </w:t>
                   </w:r>
                 </w:p>
-                <w:p wp14:textId="6FCEFD94">
-                  <w:pPr>
-                    <w:pStyle w:val="ListParagraph"/>
+                <w:p>
+                  <w:pPr>
+                    <w:pStyle w:val="PargrafodaLista"/>
                     <w:numPr>
                       <w:ilvl w:val="0"/>
                       <w:numId w:val="1"/>
                     </w:numPr>
-                    <w:jc w:val="left"/>
                     <w:rPr>
                       <w:sz w:val="20"/>
                       <w:szCs w:val="20"/>
@@ -1882,25 +1800,22 @@
                     <w:t>.</w:t>
                   </w:r>
                 </w:p>
-                <w:p wp14:textId="25BC0BF0">
-                  <w:pPr>
-                    <w:pStyle w:val="ListParagraph"/>
-                    <w:ind w:left="720"/>
-                    <w:jc w:val="left"/>
-                    <w:rPr>
-                      <w:sz w:val="20"/>
-                      <w:szCs w:val="20"/>
-                    </w:rPr>
-                  </w:pPr>
-                </w:p>
-                <w:p wp14:textId="602CFDB4">
-                  <w:pPr>
-                    <w:pStyle w:val="ListParagraph"/>
+                <w:p>
+                  <w:pPr>
+                    <w:pStyle w:val="PargrafodaLista"/>
+                    <w:rPr>
+                      <w:sz w:val="20"/>
+                      <w:szCs w:val="20"/>
+                    </w:rPr>
+                  </w:pPr>
+                </w:p>
+                <w:p>
+                  <w:pPr>
+                    <w:pStyle w:val="PargrafodaLista"/>
                     <w:numPr>
                       <w:ilvl w:val="0"/>
                       <w:numId w:val="1"/>
                     </w:numPr>
-                    <w:jc w:val="left"/>
                     <w:rPr>
                       <w:sz w:val="20"/>
                       <w:szCs w:val="20"/>
@@ -1921,25 +1836,22 @@
                     <w:t>.</w:t>
                   </w:r>
                 </w:p>
-                <w:p wp14:textId="670F1AB7">
-                  <w:pPr>
-                    <w:pStyle w:val="ListParagraph"/>
-                    <w:ind w:left="720"/>
-                    <w:jc w:val="left"/>
-                    <w:rPr>
-                      <w:sz w:val="20"/>
-                      <w:szCs w:val="20"/>
-                    </w:rPr>
-                  </w:pPr>
-                </w:p>
-                <w:p wp14:textId="25120E1C">
-                  <w:pPr>
-                    <w:pStyle w:val="ListParagraph"/>
+                <w:p>
+                  <w:pPr>
+                    <w:pStyle w:val="PargrafodaLista"/>
+                    <w:rPr>
+                      <w:sz w:val="20"/>
+                      <w:szCs w:val="20"/>
+                    </w:rPr>
+                  </w:pPr>
+                </w:p>
+                <w:p>
+                  <w:pPr>
+                    <w:pStyle w:val="PargrafodaLista"/>
                     <w:numPr>
                       <w:ilvl w:val="0"/>
                       <w:numId w:val="1"/>
                     </w:numPr>
-                    <w:jc w:val="left"/>
                     <w:rPr>
                       <w:sz w:val="20"/>
                       <w:szCs w:val="20"/>
@@ -1953,25 +1865,22 @@
                     <w:t>Exclua a atividade.</w:t>
                   </w:r>
                 </w:p>
-                <w:p wp14:textId="553C1095">
-                  <w:pPr>
-                    <w:pStyle w:val="ListParagraph"/>
-                    <w:ind w:left="720"/>
-                    <w:jc w:val="left"/>
-                    <w:rPr>
-                      <w:sz w:val="20"/>
-                      <w:szCs w:val="20"/>
-                    </w:rPr>
-                  </w:pPr>
-                </w:p>
-                <w:p wp14:textId="4A449F98">
-                  <w:pPr>
-                    <w:pStyle w:val="ListParagraph"/>
+                <w:p>
+                  <w:pPr>
+                    <w:pStyle w:val="PargrafodaLista"/>
+                    <w:rPr>
+                      <w:sz w:val="20"/>
+                      <w:szCs w:val="20"/>
+                    </w:rPr>
+                  </w:pPr>
+                </w:p>
+                <w:p>
+                  <w:pPr>
+                    <w:pStyle w:val="PargrafodaLista"/>
                     <w:numPr>
                       <w:ilvl w:val="0"/>
                       <w:numId w:val="1"/>
                     </w:numPr>
-                    <w:jc w:val="left"/>
                     <w:rPr>
                       <w:sz w:val="20"/>
                       <w:szCs w:val="20"/>
@@ -1985,11 +1894,9 @@
                     <w:t>Volte para a tela principal.</w:t>
                   </w:r>
                 </w:p>
-                <w:p wp14:textId="2372B4A1">
-                  <w:pPr>
-                    <w:pStyle w:val="ListParagraph"/>
-                    <w:ind w:left="720"/>
-                    <w:jc w:val="left"/>
+                <w:p>
+                  <w:pPr>
+                    <w:pStyle w:val="PargrafodaLista"/>
                     <w:rPr>
                       <w:sz w:val="20"/>
                       <w:szCs w:val="20"/>
@@ -2000,10 +1907,9 @@
               <w:tc>
                 <w:tcPr>
                   <w:tcW w:w="3402" w:type="dxa"/>
-                  <w:tcMar/>
                   <w:vAlign w:val="center"/>
                 </w:tcPr>
-                <w:p wp14:textId="0450C803">
+                <w:p>
                   <w:pPr>
                     <w:jc w:val="center"/>
                     <w:rPr>
@@ -2016,6 +1922,7 @@
                       <w:sz w:val="20"/>
                       <w:szCs w:val="20"/>
                     </w:rPr>
+                    <w:lastRenderedPageBreak/>
                     <w:t>O</w:t>
                   </w:r>
                   <w:r>
@@ -2023,32 +1930,238 @@
                       <w:sz w:val="20"/>
                       <w:szCs w:val="20"/>
                     </w:rPr>
-                    <w:t xml:space="preserve"> </w:t>
-                  </w:r>
-                  <w:r>
-                    <w:rPr>
-                      <w:sz w:val="20"/>
-                      <w:szCs w:val="20"/>
-                    </w:rPr>
-                    <w:t>tester</w:t>
-                  </w:r>
-                  <w:r>
-                    <w:rPr>
-                      <w:sz w:val="20"/>
-                      <w:szCs w:val="20"/>
-                    </w:rPr>
-                    <w:t xml:space="preserve"> deve conseguir executar esses passos sem ajuda de alguém que conheça como o software funciona, e não deve ocorrer nenhum erro.</w:t>
+                    <w:t xml:space="preserve"> tester deve conseguir executar esses passos sem ajuda de alguém que conheça como o software funciona, e não deve </w:t>
+                  </w:r>
+                  <w:r>
+                    <w:rPr>
+                      <w:sz w:val="20"/>
+                      <w:szCs w:val="20"/>
+                      <w:u w:val="single"/>
+                    </w:rPr>
+                    <w:t>ocorrer</w:t>
+                  </w:r>
+                  <w:r>
+                    <w:rPr>
+                      <w:sz w:val="20"/>
+                      <w:szCs w:val="20"/>
+                    </w:rPr>
+                    <w:t xml:space="preserve"> nenhum erro.</w:t>
                   </w:r>
                 </w:p>
               </w:tc>
             </w:tr>
           </w:tbl>
-          <w:p wp14:textId="77777777"/>
+          <w:p/>
         </w:tc>
       </w:tr>
     </w:tbl>
-    <w:p xmlns:wp14="http://schemas.microsoft.com/office/word/2010/wordml" wp14:textId="77777777"/>
-    <w:p xmlns:wp14="http://schemas.microsoft.com/office/word/2010/wordml" wp14:textId="77777777">
+    <w:p>
+      <w:pPr>
+        <w:rPr>
+          <w:b/>
+          <w:bCs/>
+        </w:rPr>
+      </w:pPr>
+    </w:p>
+    <w:p>
+      <w:pPr>
+        <w:rPr>
+          <w:b/>
+          <w:bCs/>
+        </w:rPr>
+      </w:pPr>
+    </w:p>
+    <w:p>
+      <w:pPr>
+        <w:rPr>
+          <w:b/>
+          <w:bCs/>
+        </w:rPr>
+      </w:pPr>
+    </w:p>
+    <w:p>
+      <w:pPr>
+        <w:rPr>
+          <w:b/>
+          <w:bCs/>
+        </w:rPr>
+      </w:pPr>
+    </w:p>
+    <w:p>
+      <w:pPr>
+        <w:rPr>
+          <w:b/>
+          <w:bCs/>
+        </w:rPr>
+      </w:pPr>
+    </w:p>
+    <w:p>
+      <w:pPr>
+        <w:rPr>
+          <w:b/>
+          <w:bCs/>
+        </w:rPr>
+      </w:pPr>
+    </w:p>
+    <w:p>
+      <w:pPr>
+        <w:rPr>
+          <w:b/>
+          <w:bCs/>
+        </w:rPr>
+      </w:pPr>
+    </w:p>
+    <w:p>
+      <w:pPr>
+        <w:rPr>
+          <w:b/>
+          <w:bCs/>
+        </w:rPr>
+      </w:pPr>
+    </w:p>
+    <w:p>
+      <w:pPr>
+        <w:rPr>
+          <w:b/>
+          <w:bCs/>
+        </w:rPr>
+      </w:pPr>
+    </w:p>
+    <w:p>
+      <w:pPr>
+        <w:rPr>
+          <w:b/>
+          <w:bCs/>
+        </w:rPr>
+      </w:pPr>
+    </w:p>
+    <w:p>
+      <w:pPr>
+        <w:rPr>
+          <w:b/>
+          <w:bCs/>
+        </w:rPr>
+      </w:pPr>
+    </w:p>
+    <w:p>
+      <w:pPr>
+        <w:rPr>
+          <w:b/>
+          <w:bCs/>
+        </w:rPr>
+      </w:pPr>
+    </w:p>
+    <w:p>
+      <w:pPr>
+        <w:rPr>
+          <w:b/>
+          <w:bCs/>
+        </w:rPr>
+      </w:pPr>
+    </w:p>
+    <w:p>
+      <w:pPr>
+        <w:rPr>
+          <w:b/>
+          <w:bCs/>
+        </w:rPr>
+      </w:pPr>
+    </w:p>
+    <w:p>
+      <w:pPr>
+        <w:rPr>
+          <w:b/>
+          <w:bCs/>
+        </w:rPr>
+      </w:pPr>
+    </w:p>
+    <w:p>
+      <w:pPr>
+        <w:rPr>
+          <w:b/>
+          <w:bCs/>
+        </w:rPr>
+      </w:pPr>
+    </w:p>
+    <w:p>
+      <w:pPr>
+        <w:rPr>
+          <w:b/>
+          <w:bCs/>
+        </w:rPr>
+      </w:pPr>
+    </w:p>
+    <w:p>
+      <w:pPr>
+        <w:rPr>
+          <w:b/>
+          <w:bCs/>
+        </w:rPr>
+      </w:pPr>
+    </w:p>
+    <w:p>
+      <w:pPr>
+        <w:rPr>
+          <w:b/>
+          <w:bCs/>
+        </w:rPr>
+      </w:pPr>
+    </w:p>
+    <w:p>
+      <w:pPr>
+        <w:rPr>
+          <w:b/>
+          <w:bCs/>
+        </w:rPr>
+      </w:pPr>
+    </w:p>
+    <w:p>
+      <w:pPr>
+        <w:rPr>
+          <w:b/>
+          <w:bCs/>
+        </w:rPr>
+      </w:pPr>
+    </w:p>
+    <w:p>
+      <w:pPr>
+        <w:rPr>
+          <w:b/>
+          <w:bCs/>
+        </w:rPr>
+      </w:pPr>
+    </w:p>
+    <w:p>
+      <w:pPr>
+        <w:rPr>
+          <w:b/>
+          <w:bCs/>
+        </w:rPr>
+      </w:pPr>
+      <w:r>
+        <w:rPr>
+          <w:b/>
+          <w:bCs/>
+        </w:rPr>
+        <w:lastRenderedPageBreak/>
+        <w:t>2</w:t>
+      </w:r>
+      <w:r>
+        <w:rPr>
+          <w:b/>
+          <w:bCs/>
+        </w:rPr>
+        <w:t xml:space="preserve"> – Teste de usabilidade </w:t>
+      </w:r>
+      <w:r>
+        <w:rPr>
+          <w:b/>
+          <w:bCs/>
+        </w:rPr>
+        <w:t>responsável</w:t>
+      </w:r>
+    </w:p>
+    <w:p>
       <w:pPr>
         <w:rPr>
           <w:sz w:val="20"/>
@@ -2058,7 +2171,31 @@
         <w:rPr>
           <w:sz w:val="20"/>
         </w:rPr>
-        <w:t>1.2 – Nome do item</w:t>
+        <w:t>2</w:t>
+      </w:r>
+      <w:r>
+        <w:rPr>
+          <w:sz w:val="20"/>
+        </w:rPr>
+        <w:t>.</w:t>
+      </w:r>
+      <w:r>
+        <w:rPr>
+          <w:sz w:val="20"/>
+        </w:rPr>
+        <w:t>1</w:t>
+      </w:r>
+      <w:r>
+        <w:rPr>
+          <w:sz w:val="20"/>
+        </w:rPr>
+        <w:t xml:space="preserve"> – </w:t>
+      </w:r>
+      <w:r>
+        <w:rPr>
+          <w:sz w:val="20"/>
+        </w:rPr>
+        <w:t>Responsável</w:t>
       </w:r>
     </w:p>
     <w:tbl>
@@ -2078,7 +2215,7 @@
         <w:gridCol w:w="1455"/>
         <w:gridCol w:w="1511"/>
       </w:tblGrid>
-      <w:tr xmlns:wp14="http://schemas.microsoft.com/office/word/2010/wordml" wp14:textId="77777777">
+      <w:tr>
         <w:trPr>
           <w:trHeight w:val="342"/>
         </w:trPr>
@@ -2087,7 +2224,7 @@
             <w:tcW w:w="1271" w:type="dxa"/>
             <w:shd w:val="clear" w:color="auto" w:fill="4472C4" w:themeFill="accent1"/>
           </w:tcPr>
-          <w:p wp14:textId="77777777">
+          <w:p>
             <w:pPr>
               <w:jc w:val="center"/>
               <w:rPr>
@@ -2110,7 +2247,7 @@
           <w:tcPr>
             <w:tcW w:w="851" w:type="dxa"/>
           </w:tcPr>
-          <w:p wp14:textId="77777777">
+          <w:p>
             <w:pPr>
               <w:rPr>
                 <w:noProof/>
@@ -2125,7 +2262,7 @@
               <mc:AlternateContent>
                 <mc:Choice Requires="wps">
                   <w:drawing>
-                    <wp:anchor xmlns:wp14="http://schemas.microsoft.com/office/word/2010/wordprocessingDrawing" distT="0" distB="0" distL="114300" distR="114300" simplePos="0" relativeHeight="251691008" behindDoc="0" locked="0" layoutInCell="1" allowOverlap="1" wp14:anchorId="5182F517" wp14:editId="2801585C">
+                    <wp:anchor distT="0" distB="0" distL="114300" distR="114300" simplePos="0" relativeHeight="251691008" behindDoc="0" locked="0" layoutInCell="1" allowOverlap="1" wp14:anchorId="5182F517" wp14:editId="2801585C">
                       <wp:simplePos x="0" y="0"/>
                       <wp:positionH relativeFrom="column">
                         <wp:posOffset>3175</wp:posOffset>
@@ -2190,7 +2327,7 @@
                     </wp:anchor>
                   </w:drawing>
                 </mc:Choice>
-                <mc:Fallback>
+                <mc:Fallback xmlns:wp14="http://schemas.microsoft.com/office/word/2010/wordml" xmlns:a="http://schemas.openxmlformats.org/drawingml/2006/main">
                   <w:pict w14:anchorId="7852ACC9">
                     <v:rect id="Retângulo 26" style="position:absolute;margin-left:.25pt;margin-top:2.8pt;width:7.95pt;height:8.9pt;z-index:251691008;visibility:visible;mso-wrap-style:square;mso-width-percent:0;mso-height-percent:0;mso-wrap-distance-left:9pt;mso-wrap-distance-top:0;mso-wrap-distance-right:9pt;mso-wrap-distance-bottom:0;mso-position-horizontal:absolute;mso-position-horizontal-relative:text;mso-position-vertical:absolute;mso-position-vertical-relative:text;mso-width-percent:0;mso-height-percent:0;mso-width-relative:margin;mso-height-relative:margin;v-text-anchor:middle" o:spid="_x0000_s1026" fillcolor="#a5a5a5 [2092]" strokecolor="black [1600]" strokeweight="1pt" w14:anchorId="34E442C2" o:gfxdata="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"/>
                   </w:pict>
@@ -2210,7 +2347,7 @@
             <w:tcW w:w="1984" w:type="dxa"/>
             <w:gridSpan w:val="2"/>
           </w:tcPr>
-          <w:p wp14:textId="77777777">
+          <w:p>
             <w:pPr>
               <w:rPr>
                 <w:noProof/>
@@ -2225,7 +2362,7 @@
               <mc:AlternateContent>
                 <mc:Choice Requires="wps">
                   <w:drawing>
-                    <wp:anchor xmlns:wp14="http://schemas.microsoft.com/office/word/2010/wordprocessingDrawing" distT="0" distB="0" distL="114300" distR="114300" simplePos="0" relativeHeight="251692032" behindDoc="0" locked="0" layoutInCell="1" allowOverlap="1" wp14:anchorId="56A79591" wp14:editId="7621B4D6">
+                    <wp:anchor distT="0" distB="0" distL="114300" distR="114300" simplePos="0" relativeHeight="251692032" behindDoc="0" locked="0" layoutInCell="1" allowOverlap="1" wp14:anchorId="56A79591" wp14:editId="7621B4D6">
                       <wp:simplePos x="0" y="0"/>
                       <wp:positionH relativeFrom="column">
                         <wp:posOffset>3175</wp:posOffset>
@@ -2288,7 +2425,7 @@
                     </wp:anchor>
                   </w:drawing>
                 </mc:Choice>
-                <mc:Fallback>
+                <mc:Fallback xmlns:wp14="http://schemas.microsoft.com/office/word/2010/wordml" xmlns:a="http://schemas.openxmlformats.org/drawingml/2006/main">
                   <w:pict w14:anchorId="6D47E317">
                     <v:rect id="Retângulo 27" style="position:absolute;margin-left:.25pt;margin-top:2.8pt;width:7.95pt;height:8.9pt;z-index:251692032;visibility:visible;mso-wrap-style:square;mso-width-percent:0;mso-height-percent:0;mso-wrap-distance-left:9pt;mso-wrap-distance-top:0;mso-wrap-distance-right:9pt;mso-wrap-distance-bottom:0;mso-position-horizontal:absolute;mso-position-horizontal-relative:text;mso-position-vertical:absolute;mso-position-vertical-relative:text;mso-width-percent:0;mso-height-percent:0;mso-width-relative:margin;mso-height-relative:margin;v-text-anchor:middle" o:spid="_x0000_s1026" fillcolor="white [3212]" strokecolor="black [1600]" strokeweight="1pt" w14:anchorId="3A33C7B4" o:gfxdata="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"/>
                   </w:pict>
@@ -2308,7 +2445,7 @@
             <w:tcW w:w="5102" w:type="dxa"/>
             <w:gridSpan w:val="4"/>
           </w:tcPr>
-          <w:p wp14:textId="77777777">
+          <w:p>
             <w:pPr>
               <w:rPr>
                 <w:noProof/>
@@ -2330,7 +2467,7 @@
               <mc:AlternateContent>
                 <mc:Choice Requires="wps">
                   <w:drawing>
-                    <wp:anchor xmlns:wp14="http://schemas.microsoft.com/office/word/2010/wordprocessingDrawing" distT="0" distB="0" distL="114300" distR="114300" simplePos="0" relativeHeight="251693056" behindDoc="0" locked="0" layoutInCell="1" allowOverlap="1" wp14:anchorId="06237BCB" wp14:editId="1A50CC93">
+                    <wp:anchor distT="0" distB="0" distL="114300" distR="114300" simplePos="0" relativeHeight="251693056" behindDoc="0" locked="0" layoutInCell="1" allowOverlap="1" wp14:anchorId="06237BCB" wp14:editId="1A50CC93">
                       <wp:simplePos x="0" y="0"/>
                       <wp:positionH relativeFrom="column">
                         <wp:posOffset>3175</wp:posOffset>
@@ -2393,7 +2530,7 @@
                     </wp:anchor>
                   </w:drawing>
                 </mc:Choice>
-                <mc:Fallback>
+                <mc:Fallback xmlns:wp14="http://schemas.microsoft.com/office/word/2010/wordml" xmlns:a="http://schemas.openxmlformats.org/drawingml/2006/main">
                   <w:pict w14:anchorId="7B6F7F62">
                     <v:rect id="Retângulo 28" style="position:absolute;margin-left:.25pt;margin-top:2.8pt;width:7.95pt;height:8.9pt;z-index:251693056;visibility:visible;mso-wrap-style:square;mso-width-percent:0;mso-height-percent:0;mso-wrap-distance-left:9pt;mso-wrap-distance-top:0;mso-wrap-distance-right:9pt;mso-wrap-distance-bottom:0;mso-position-horizontal:absolute;mso-position-horizontal-relative:text;mso-position-vertical:absolute;mso-position-vertical-relative:text;mso-width-percent:0;mso-height-percent:0;mso-width-relative:margin;mso-height-relative:margin;v-text-anchor:middle" o:spid="_x0000_s1026" fillcolor="white [3212]" strokecolor="black [1600]" strokeweight="1pt" w14:anchorId="5198A9BB" o:gfxdata="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"/>
                   </w:pict>
@@ -2410,13 +2547,13 @@
           </w:p>
         </w:tc>
       </w:tr>
-      <w:tr xmlns:wp14="http://schemas.microsoft.com/office/word/2010/wordml" wp14:textId="77777777">
+      <w:tr>
         <w:tc>
           <w:tcPr>
             <w:tcW w:w="1271" w:type="dxa"/>
             <w:shd w:val="clear" w:color="auto" w:fill="4472C4" w:themeFill="accent1"/>
           </w:tcPr>
-          <w:p wp14:textId="77777777">
+          <w:p>
             <w:pPr>
               <w:jc w:val="center"/>
               <w:rPr>
@@ -2439,14 +2576,14 @@
           <w:tcPr>
             <w:tcW w:w="851" w:type="dxa"/>
           </w:tcPr>
-          <w:p wp14:textId="77777777"/>
+          <w:p/>
         </w:tc>
         <w:tc>
           <w:tcPr>
             <w:tcW w:w="1656" w:type="dxa"/>
             <w:shd w:val="clear" w:color="auto" w:fill="4472C4" w:themeFill="accent1"/>
           </w:tcPr>
-          <w:p wp14:textId="77777777">
+          <w:p>
             <w:pPr>
               <w:jc w:val="center"/>
               <w:rPr>
@@ -2470,7 +2607,7 @@
             <w:tcW w:w="2464" w:type="dxa"/>
             <w:gridSpan w:val="3"/>
           </w:tcPr>
-          <w:p wp14:textId="77777777">
+          <w:p>
             <w:pPr>
               <w:rPr>
                 <w:sz w:val="20"/>
@@ -2490,7 +2627,7 @@
               <mc:AlternateContent>
                 <mc:Choice Requires="wps">
                   <w:drawing>
-                    <wp:anchor xmlns:wp14="http://schemas.microsoft.com/office/word/2010/wordprocessingDrawing" distT="0" distB="0" distL="114300" distR="114300" simplePos="0" relativeHeight="251685888" behindDoc="0" locked="0" layoutInCell="1" allowOverlap="1" wp14:anchorId="28C4F53A" wp14:editId="27007309">
+                    <wp:anchor distT="0" distB="0" distL="114300" distR="114300" simplePos="0" relativeHeight="251685888" behindDoc="0" locked="0" layoutInCell="1" allowOverlap="1" wp14:anchorId="28C4F53A" wp14:editId="27007309">
                       <wp:simplePos x="0" y="0"/>
                       <wp:positionH relativeFrom="column">
                         <wp:posOffset>3175</wp:posOffset>
@@ -2555,7 +2692,7 @@
                     </wp:anchor>
                   </w:drawing>
                 </mc:Choice>
-                <mc:Fallback>
+                <mc:Fallback xmlns:wp14="http://schemas.microsoft.com/office/word/2010/wordml" xmlns:a="http://schemas.openxmlformats.org/drawingml/2006/main">
                   <w:pict w14:anchorId="31739C79">
                     <v:rect id="Retângulo 29" style="position:absolute;margin-left:.25pt;margin-top:2.8pt;width:7.95pt;height:8.9pt;z-index:251685888;visibility:visible;mso-wrap-style:square;mso-width-percent:0;mso-height-percent:0;mso-wrap-distance-left:9pt;mso-wrap-distance-top:0;mso-wrap-distance-right:9pt;mso-wrap-distance-bottom:0;mso-position-horizontal:absolute;mso-position-horizontal-relative:text;mso-position-vertical:absolute;mso-position-vertical-relative:text;mso-width-percent:0;mso-height-percent:0;mso-width-relative:margin;mso-height-relative:margin;v-text-anchor:middle" o:spid="_x0000_s1026" fillcolor="#a5a5a5 [2092]" strokecolor="black [1600]" strokeweight="1pt" w14:anchorId="7FD3A9A3" o:gfxdata="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"/>
                   </w:pict>
@@ -2575,7 +2712,7 @@
             <w:tcW w:w="2966" w:type="dxa"/>
             <w:gridSpan w:val="2"/>
           </w:tcPr>
-          <w:p wp14:textId="77777777">
+          <w:p>
             <w:pPr>
               <w:rPr>
                 <w:sz w:val="20"/>
@@ -2589,7 +2726,7 @@
               <mc:AlternateContent>
                 <mc:Choice Requires="wps">
                   <w:drawing>
-                    <wp:anchor xmlns:wp14="http://schemas.microsoft.com/office/word/2010/wordprocessingDrawing" distT="0" distB="0" distL="114300" distR="114300" simplePos="0" relativeHeight="251686912" behindDoc="0" locked="0" layoutInCell="1" allowOverlap="1" wp14:anchorId="5749E640" wp14:editId="4913181D">
+                    <wp:anchor distT="0" distB="0" distL="114300" distR="114300" simplePos="0" relativeHeight="251686912" behindDoc="0" locked="0" layoutInCell="1" allowOverlap="1" wp14:anchorId="5749E640" wp14:editId="4913181D">
                       <wp:simplePos x="0" y="0"/>
                       <wp:positionH relativeFrom="column">
                         <wp:posOffset>3175</wp:posOffset>
@@ -2652,7 +2789,7 @@
                     </wp:anchor>
                   </w:drawing>
                 </mc:Choice>
-                <mc:Fallback>
+                <mc:Fallback xmlns:wp14="http://schemas.microsoft.com/office/word/2010/wordml" xmlns:a="http://schemas.openxmlformats.org/drawingml/2006/main">
                   <w:pict w14:anchorId="3B0E071D">
                     <v:rect id="Retângulo 30" style="position:absolute;margin-left:.25pt;margin-top:2.8pt;width:7.95pt;height:8.9pt;z-index:251686912;visibility:visible;mso-wrap-style:square;mso-width-percent:0;mso-height-percent:0;mso-wrap-distance-left:9pt;mso-wrap-distance-top:0;mso-wrap-distance-right:9pt;mso-wrap-distance-bottom:0;mso-position-horizontal:absolute;mso-position-horizontal-relative:text;mso-position-vertical:absolute;mso-position-vertical-relative:text;mso-width-percent:0;mso-height-percent:0;mso-width-relative:margin;mso-height-relative:margin;v-text-anchor:middle" o:spid="_x0000_s1026" fillcolor="white [3212]" strokecolor="black [1600]" strokeweight="1pt" w14:anchorId="226203D0" o:gfxdata="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"/>
                   </w:pict>
@@ -2680,14 +2817,14 @@
           </w:p>
         </w:tc>
       </w:tr>
-      <w:tr xmlns:wp14="http://schemas.microsoft.com/office/word/2010/wordml" wp14:textId="77777777">
+      <w:tr>
         <w:tc>
           <w:tcPr>
             <w:tcW w:w="1271" w:type="dxa"/>
             <w:shd w:val="clear" w:color="auto" w:fill="4472C4" w:themeFill="accent1"/>
             <w:vAlign w:val="center"/>
           </w:tcPr>
-          <w:p wp14:textId="77777777">
+          <w:p>
             <w:pPr>
               <w:jc w:val="center"/>
               <w:rPr>
@@ -2710,7 +2847,7 @@
           <w:tcPr>
             <w:tcW w:w="851" w:type="dxa"/>
           </w:tcPr>
-          <w:p wp14:textId="77777777">
+          <w:p>
             <w:pPr>
               <w:rPr>
                 <w:b/>
@@ -2729,7 +2866,7 @@
             <w:tcW w:w="1656" w:type="dxa"/>
             <w:shd w:val="clear" w:color="auto" w:fill="4472C4" w:themeFill="accent1"/>
           </w:tcPr>
-          <w:p wp14:textId="77777777">
+          <w:p>
             <w:pPr>
               <w:jc w:val="center"/>
               <w:rPr>
@@ -2753,7 +2890,7 @@
             <w:tcW w:w="1167" w:type="dxa"/>
             <w:gridSpan w:val="2"/>
           </w:tcPr>
-          <w:p wp14:textId="77777777">
+          <w:p>
             <w:pPr>
               <w:rPr>
                 <w:sz w:val="20"/>
@@ -2766,7 +2903,7 @@
               <w:t>Usabilidade</w:t>
             </w:r>
           </w:p>
-          <w:p wp14:textId="77777777">
+          <w:p>
             <w:pPr>
               <w:rPr>
                 <w:sz w:val="20"/>
@@ -2780,7 +2917,7 @@
               <mc:AlternateContent>
                 <mc:Choice Requires="wps">
                   <w:drawing>
-                    <wp:anchor xmlns:wp14="http://schemas.microsoft.com/office/word/2010/wordprocessingDrawing" distT="0" distB="0" distL="114300" distR="114300" simplePos="0" relativeHeight="251687936" behindDoc="0" locked="0" layoutInCell="1" allowOverlap="1" wp14:anchorId="7C90FBD4" wp14:editId="6119F86A">
+                    <wp:anchor distT="0" distB="0" distL="114300" distR="114300" simplePos="0" relativeHeight="251687936" behindDoc="0" locked="0" layoutInCell="1" allowOverlap="1" wp14:anchorId="7C90FBD4" wp14:editId="6119F86A">
                       <wp:simplePos x="0" y="0"/>
                       <wp:positionH relativeFrom="column">
                         <wp:posOffset>283738</wp:posOffset>
@@ -2845,7 +2982,7 @@
                     </wp:anchor>
                   </w:drawing>
                 </mc:Choice>
-                <mc:Fallback>
+                <mc:Fallback xmlns:wp14="http://schemas.microsoft.com/office/word/2010/wordml" xmlns:a="http://schemas.openxmlformats.org/drawingml/2006/main">
                   <w:pict w14:anchorId="410EA0DA">
                     <v:rect id="Retângulo 31" style="position:absolute;margin-left:22.35pt;margin-top:1.2pt;width:7.95pt;height:8.9pt;z-index:251687936;visibility:visible;mso-wrap-style:square;mso-width-percent:0;mso-height-percent:0;mso-wrap-distance-left:9pt;mso-wrap-distance-top:0;mso-wrap-distance-right:9pt;mso-wrap-distance-bottom:0;mso-position-horizontal:absolute;mso-position-horizontal-relative:text;mso-position-vertical:absolute;mso-position-vertical-relative:text;mso-width-percent:0;mso-height-percent:0;mso-width-relative:margin;mso-height-relative:margin;v-text-anchor:middle" o:spid="_x0000_s1026" fillcolor="#a5a5a5 [2092]" strokecolor="black [1600]" strokeweight="1pt" w14:anchorId="566F710B" o:gfxdata="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"/>
                   </w:pict>
@@ -2858,7 +2995,7 @@
           <w:tcPr>
             <w:tcW w:w="1297" w:type="dxa"/>
           </w:tcPr>
-          <w:p wp14:textId="77777777">
+          <w:p>
             <w:pPr>
               <w:rPr>
                 <w:sz w:val="20"/>
@@ -2871,7 +3008,7 @@
               <w:t>Desempenho</w:t>
             </w:r>
           </w:p>
-          <w:p wp14:textId="77777777">
+          <w:p>
             <w:pPr>
               <w:rPr>
                 <w:sz w:val="20"/>
@@ -2885,7 +3022,7 @@
               <mc:AlternateContent>
                 <mc:Choice Requires="wps">
                   <w:drawing>
-                    <wp:anchor xmlns:wp14="http://schemas.microsoft.com/office/word/2010/wordprocessingDrawing" distT="0" distB="0" distL="114300" distR="114300" simplePos="0" relativeHeight="251688960" behindDoc="0" locked="0" layoutInCell="1" allowOverlap="1" wp14:anchorId="3C5BD2D9" wp14:editId="29B4AE98">
+                    <wp:anchor distT="0" distB="0" distL="114300" distR="114300" simplePos="0" relativeHeight="251688960" behindDoc="0" locked="0" layoutInCell="1" allowOverlap="1" wp14:anchorId="3C5BD2D9" wp14:editId="29B4AE98">
                       <wp:simplePos x="0" y="0"/>
                       <wp:positionH relativeFrom="column">
                         <wp:posOffset>343749</wp:posOffset>
@@ -2948,7 +3085,7 @@
                     </wp:anchor>
                   </w:drawing>
                 </mc:Choice>
-                <mc:Fallback>
+                <mc:Fallback xmlns:wp14="http://schemas.microsoft.com/office/word/2010/wordml" xmlns:a="http://schemas.openxmlformats.org/drawingml/2006/main">
                   <w:pict w14:anchorId="69F03EC1">
                     <v:rect id="Retângulo 32" style="position:absolute;margin-left:27.05pt;margin-top:1.2pt;width:7.95pt;height:8.9pt;z-index:251688960;visibility:visible;mso-wrap-style:square;mso-width-percent:0;mso-height-percent:0;mso-wrap-distance-left:9pt;mso-wrap-distance-top:0;mso-wrap-distance-right:9pt;mso-wrap-distance-bottom:0;mso-position-horizontal:absolute;mso-position-horizontal-relative:text;mso-position-vertical:absolute;mso-position-vertical-relative:text;mso-width-percent:0;mso-height-percent:0;mso-width-relative:margin;mso-height-relative:margin;v-text-anchor:middle" o:spid="_x0000_s1026" fillcolor="white [3212]" strokecolor="black [1600]" strokeweight="1pt" w14:anchorId="2B378525" o:gfxdata="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"/>
                   </w:pict>
@@ -2961,7 +3098,7 @@
           <w:tcPr>
             <w:tcW w:w="1455" w:type="dxa"/>
           </w:tcPr>
-          <w:p wp14:textId="77777777">
+          <w:p>
             <w:pPr>
               <w:rPr>
                 <w:sz w:val="20"/>
@@ -2974,7 +3111,7 @@
               <w:t>Funcionalidade</w:t>
             </w:r>
           </w:p>
-          <w:p wp14:textId="77777777">
+          <w:p>
             <w:pPr>
               <w:rPr>
                 <w:sz w:val="20"/>
@@ -2988,7 +3125,7 @@
               <mc:AlternateContent>
                 <mc:Choice Requires="wps">
                   <w:drawing>
-                    <wp:anchor xmlns:wp14="http://schemas.microsoft.com/office/word/2010/wordprocessingDrawing" distT="0" distB="0" distL="114300" distR="114300" simplePos="0" relativeHeight="251689984" behindDoc="0" locked="0" layoutInCell="1" allowOverlap="1" wp14:anchorId="139AB5F1" wp14:editId="3142A549">
+                    <wp:anchor distT="0" distB="0" distL="114300" distR="114300" simplePos="0" relativeHeight="251689984" behindDoc="0" locked="0" layoutInCell="1" allowOverlap="1" wp14:anchorId="139AB5F1" wp14:editId="3142A549">
                       <wp:simplePos x="0" y="0"/>
                       <wp:positionH relativeFrom="column">
                         <wp:posOffset>343749</wp:posOffset>
@@ -3051,7 +3188,7 @@
                     </wp:anchor>
                   </w:drawing>
                 </mc:Choice>
-                <mc:Fallback>
+                <mc:Fallback xmlns:wp14="http://schemas.microsoft.com/office/word/2010/wordml" xmlns:a="http://schemas.openxmlformats.org/drawingml/2006/main">
                   <w:pict w14:anchorId="5852265E">
                     <v:rect id="Retângulo 33" style="position:absolute;margin-left:27.05pt;margin-top:1.2pt;width:7.95pt;height:8.9pt;z-index:251689984;visibility:visible;mso-wrap-style:square;mso-width-percent:0;mso-height-percent:0;mso-wrap-distance-left:9pt;mso-wrap-distance-top:0;mso-wrap-distance-right:9pt;mso-wrap-distance-bottom:0;mso-position-horizontal:absolute;mso-position-horizontal-relative:text;mso-position-vertical:absolute;mso-position-vertical-relative:text;mso-width-percent:0;mso-height-percent:0;mso-width-relative:margin;mso-height-relative:margin;v-text-anchor:middle" o:spid="_x0000_s1026" fillcolor="white [3212]" strokecolor="black [1600]" strokeweight="1pt" w14:anchorId="653178C5" o:gfxdata="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"/>
                   </w:pict>
@@ -3064,7 +3201,7 @@
           <w:tcPr>
             <w:tcW w:w="1511" w:type="dxa"/>
           </w:tcPr>
-          <w:p wp14:textId="77777777">
+          <w:p>
             <w:pPr>
               <w:rPr>
                 <w:sz w:val="20"/>
@@ -3079,13 +3216,13 @@
           </w:p>
         </w:tc>
       </w:tr>
-      <w:tr xmlns:wp14="http://schemas.microsoft.com/office/word/2010/wordml" wp14:textId="77777777">
+      <w:tr>
         <w:tc>
           <w:tcPr>
             <w:tcW w:w="1271" w:type="dxa"/>
             <w:shd w:val="clear" w:color="auto" w:fill="4472C4" w:themeFill="accent1"/>
           </w:tcPr>
-          <w:p wp14:textId="77777777">
+          <w:p>
             <w:pPr>
               <w:jc w:val="center"/>
               <w:rPr>
@@ -3109,16 +3246,20 @@
             <w:tcW w:w="7937" w:type="dxa"/>
             <w:gridSpan w:val="7"/>
           </w:tcPr>
-          <w:p wp14:textId="77777777"/>
+          <w:p>
+            <w:r>
+              <w:t>Realizar um teste de campo da aplicação com personas reais (Caixa preta)</w:t>
+            </w:r>
+          </w:p>
         </w:tc>
       </w:tr>
-      <w:tr xmlns:wp14="http://schemas.microsoft.com/office/word/2010/wordml" wp14:textId="77777777">
+      <w:tr>
         <w:tc>
           <w:tcPr>
             <w:tcW w:w="1271" w:type="dxa"/>
             <w:shd w:val="clear" w:color="auto" w:fill="4472C4" w:themeFill="accent1"/>
           </w:tcPr>
-          <w:p wp14:textId="77777777">
+          <w:p>
             <w:pPr>
               <w:jc w:val="center"/>
               <w:rPr>
@@ -3142,18 +3283,22 @@
             <w:tcW w:w="7937" w:type="dxa"/>
             <w:gridSpan w:val="7"/>
           </w:tcPr>
-          <w:p wp14:textId="77777777"/>
+          <w:p>
+            <w:r>
+              <w:t>Comprovar a disponibilidade, usabilidade e escalabilidade da aplicação</w:t>
+            </w:r>
+          </w:p>
         </w:tc>
       </w:tr>
-      <w:tr xmlns:wp14="http://schemas.microsoft.com/office/word/2010/wordml" wp14:textId="77777777">
+      <w:tr>
         <w:trPr>
-          <w:trHeight w:val="1698"/>
+          <w:trHeight w:val="704"/>
         </w:trPr>
         <w:tc>
           <w:tcPr>
             <w:tcW w:w="1271" w:type="dxa"/>
           </w:tcPr>
-          <w:p wp14:textId="77777777">
+          <w:p>
             <w:pPr>
               <w:rPr>
                 <w:b/>
@@ -3180,14 +3325,14 @@
               <w:gridCol w:w="3222"/>
               <w:gridCol w:w="3402"/>
             </w:tblGrid>
-            <w:tr wp14:textId="77777777">
+            <w:tr>
               <w:tc>
                 <w:tcPr>
                   <w:tcW w:w="742" w:type="dxa"/>
                   <w:shd w:val="clear" w:color="auto" w:fill="000000" w:themeFill="text1"/>
                   <w:vAlign w:val="center"/>
                 </w:tcPr>
-                <w:p wp14:textId="77777777">
+                <w:p>
                   <w:pPr>
                     <w:jc w:val="center"/>
                     <w:rPr>
@@ -3208,7 +3353,7 @@
                   <w:shd w:val="clear" w:color="auto" w:fill="000000" w:themeFill="text1"/>
                   <w:vAlign w:val="center"/>
                 </w:tcPr>
-                <w:p wp14:textId="77777777">
+                <w:p>
                   <w:pPr>
                     <w:jc w:val="center"/>
                     <w:rPr>
@@ -3229,7 +3374,7 @@
                   <w:shd w:val="clear" w:color="auto" w:fill="000000" w:themeFill="text1"/>
                   <w:vAlign w:val="center"/>
                 </w:tcPr>
-                <w:p wp14:textId="77777777">
+                <w:p>
                   <w:pPr>
                     <w:jc w:val="center"/>
                     <w:rPr>
@@ -3245,19 +3390,25 @@
                 </w:p>
               </w:tc>
             </w:tr>
-            <w:tr wp14:textId="77777777">
+            <w:tr>
               <w:tc>
                 <w:tcPr>
                   <w:tcW w:w="742" w:type="dxa"/>
                   <w:vAlign w:val="center"/>
                 </w:tcPr>
-                <w:p wp14:textId="77777777">
+                <w:p>
                   <w:pPr>
                     <w:jc w:val="center"/>
                     <w:rPr>
                       <w:sz w:val="20"/>
                     </w:rPr>
                   </w:pPr>
+                  <w:r>
+                    <w:rPr>
+                      <w:sz w:val="20"/>
+                    </w:rPr>
+                    <w:t>001</w:t>
+                  </w:r>
                 </w:p>
               </w:tc>
               <w:tc>
@@ -3265,7 +3416,221 @@
                   <w:tcW w:w="3222" w:type="dxa"/>
                   <w:vAlign w:val="center"/>
                 </w:tcPr>
-                <w:p wp14:textId="77777777">
+                <w:p>
+                  <w:pPr>
+                    <w:pStyle w:val="PargrafodaLista"/>
+                    <w:rPr>
+                      <w:sz w:val="20"/>
+                      <w:szCs w:val="20"/>
+                    </w:rPr>
+                  </w:pPr>
+                  <w:r>
+                    <w:rPr>
+                      <w:sz w:val="20"/>
+                      <w:szCs w:val="20"/>
+                    </w:rPr>
+                    <w:t xml:space="preserve">O </w:t>
+                  </w:r>
+                  <w:proofErr w:type="spellStart"/>
+                  <w:r>
+                    <w:rPr>
+                      <w:sz w:val="20"/>
+                      <w:szCs w:val="20"/>
+                    </w:rPr>
+                    <w:t>tester</w:t>
+                  </w:r>
+                  <w:proofErr w:type="spellEnd"/>
+                  <w:r>
+                    <w:rPr>
+                      <w:sz w:val="20"/>
+                      <w:szCs w:val="20"/>
+                    </w:rPr>
+                    <w:t>, deve seguir os seguintes passos sem ajuda de um dos desenvolvedores:</w:t>
+                  </w:r>
+                </w:p>
+                <w:p>
+                  <w:pPr>
+                    <w:jc w:val="center"/>
+                    <w:rPr>
+                      <w:sz w:val="20"/>
+                    </w:rPr>
+                  </w:pPr>
+                </w:p>
+                <w:p>
+                  <w:pPr>
+                    <w:pStyle w:val="PargrafodaLista"/>
+                    <w:numPr>
+                      <w:ilvl w:val="0"/>
+                      <w:numId w:val="2"/>
+                    </w:numPr>
+                    <w:rPr>
+                      <w:sz w:val="20"/>
+                    </w:rPr>
+                  </w:pPr>
+                  <w:r>
+                    <w:rPr>
+                      <w:sz w:val="20"/>
+                    </w:rPr>
+                    <w:t>Faça login como responsável.</w:t>
+                  </w:r>
+                </w:p>
+                <w:p>
+                  <w:pPr>
+                    <w:pStyle w:val="PargrafodaLista"/>
+                    <w:rPr>
+                      <w:sz w:val="20"/>
+                    </w:rPr>
+                  </w:pPr>
+                </w:p>
+                <w:p>
+                  <w:pPr>
+                    <w:pStyle w:val="PargrafodaLista"/>
+                    <w:numPr>
+                      <w:ilvl w:val="0"/>
+                      <w:numId w:val="2"/>
+                    </w:numPr>
+                    <w:rPr>
+                      <w:sz w:val="20"/>
+                    </w:rPr>
+                  </w:pPr>
+                  <w:r>
+                    <w:rPr>
+                      <w:sz w:val="20"/>
+                    </w:rPr>
+                    <w:t>Realize a adição de um familiar com o número de registro: 26040002</w:t>
+                  </w:r>
+                </w:p>
+                <w:p>
+                  <w:pPr>
+                    <w:pStyle w:val="PargrafodaLista"/>
+                    <w:rPr>
+                      <w:sz w:val="20"/>
+                    </w:rPr>
+                  </w:pPr>
+                </w:p>
+                <w:p>
+                  <w:pPr>
+                    <w:pStyle w:val="PargrafodaLista"/>
+                    <w:numPr>
+                      <w:ilvl w:val="0"/>
+                      <w:numId w:val="2"/>
+                    </w:numPr>
+                    <w:rPr>
+                      <w:sz w:val="20"/>
+                    </w:rPr>
+                  </w:pPr>
+                  <w:r>
+                    <w:rPr>
+                      <w:sz w:val="20"/>
+                    </w:rPr>
+                    <w:t>Cadastre um familiar na plataforma.</w:t>
+                  </w:r>
+                </w:p>
+                <w:p>
+                  <w:pPr>
+                    <w:pStyle w:val="PargrafodaLista"/>
+                    <w:rPr>
+                      <w:sz w:val="20"/>
+                    </w:rPr>
+                  </w:pPr>
+                </w:p>
+                <w:p>
+                  <w:pPr>
+                    <w:pStyle w:val="PargrafodaLista"/>
+                    <w:numPr>
+                      <w:ilvl w:val="0"/>
+                      <w:numId w:val="2"/>
+                    </w:numPr>
+                    <w:rPr>
+                      <w:sz w:val="20"/>
+                    </w:rPr>
+                  </w:pPr>
+                  <w:r>
+                    <w:rPr>
+                      <w:sz w:val="20"/>
+                    </w:rPr>
+                    <w:t>Entre em um dos campos de habilidade.</w:t>
+                  </w:r>
+                </w:p>
+                <w:p>
+                  <w:pPr>
+                    <w:pStyle w:val="PargrafodaLista"/>
+                    <w:rPr>
+                      <w:sz w:val="20"/>
+                    </w:rPr>
+                  </w:pPr>
+                </w:p>
+                <w:p>
+                  <w:pPr>
+                    <w:pStyle w:val="PargrafodaLista"/>
+                    <w:numPr>
+                      <w:ilvl w:val="0"/>
+                      <w:numId w:val="2"/>
+                    </w:numPr>
+                    <w:rPr>
+                      <w:sz w:val="20"/>
+                    </w:rPr>
+                  </w:pPr>
+                  <w:r>
+                    <w:rPr>
+                      <w:sz w:val="20"/>
+                    </w:rPr>
+                    <w:t>Entre no histórico de tentativa de qualquer atividade cadastrada.</w:t>
+                  </w:r>
+                </w:p>
+                <w:p>
+                  <w:pPr>
+                    <w:pStyle w:val="PargrafodaLista"/>
+                    <w:rPr>
+                      <w:sz w:val="20"/>
+                    </w:rPr>
+                  </w:pPr>
+                </w:p>
+                <w:p>
+                  <w:pPr>
+                    <w:pStyle w:val="PargrafodaLista"/>
+                    <w:numPr>
+                      <w:ilvl w:val="0"/>
+                      <w:numId w:val="2"/>
+                    </w:numPr>
+                    <w:rPr>
+                      <w:sz w:val="20"/>
+                    </w:rPr>
+                  </w:pPr>
+                  <w:r>
+                    <w:rPr>
+                      <w:sz w:val="20"/>
+                    </w:rPr>
+                    <w:t>Veja os detalhes de qualquer tentativa.</w:t>
+                  </w:r>
+                </w:p>
+                <w:p>
+                  <w:pPr>
+                    <w:pStyle w:val="PargrafodaLista"/>
+                    <w:rPr>
+                      <w:sz w:val="20"/>
+                    </w:rPr>
+                  </w:pPr>
+                </w:p>
+                <w:p>
+                  <w:pPr>
+                    <w:pStyle w:val="PargrafodaLista"/>
+                    <w:numPr>
+                      <w:ilvl w:val="0"/>
+                      <w:numId w:val="2"/>
+                    </w:numPr>
+                    <w:rPr>
+                      <w:sz w:val="20"/>
+                    </w:rPr>
+                  </w:pPr>
+                  <w:r>
+                    <w:rPr>
+                      <w:sz w:val="20"/>
+                    </w:rPr>
+                    <w:t>Volte para a tela principal</w:t>
+                  </w:r>
+                </w:p>
+                <w:p>
                   <w:pPr>
                     <w:jc w:val="center"/>
                     <w:rPr>
@@ -3279,247 +3644,41 @@
                   <w:tcW w:w="3402" w:type="dxa"/>
                   <w:vAlign w:val="center"/>
                 </w:tcPr>
-                <w:p wp14:textId="77777777">
+                <w:p>
                   <w:pPr>
                     <w:jc w:val="center"/>
                     <w:rPr>
                       <w:sz w:val="20"/>
                     </w:rPr>
                   </w:pPr>
-                </w:p>
-              </w:tc>
-            </w:tr>
-            <w:tr wp14:textId="77777777">
-              <w:tc>
-                <w:tcPr>
-                  <w:tcW w:w="742" w:type="dxa"/>
-                  <w:shd w:val="clear" w:color="auto" w:fill="F2F2F2" w:themeFill="background1" w:themeFillShade="F2"/>
-                  <w:vAlign w:val="center"/>
-                </w:tcPr>
-                <w:p wp14:textId="77777777">
-                  <w:pPr>
-                    <w:jc w:val="center"/>
-                    <w:rPr>
-                      <w:sz w:val="20"/>
-                    </w:rPr>
-                  </w:pPr>
-                </w:p>
-              </w:tc>
-              <w:tc>
-                <w:tcPr>
-                  <w:tcW w:w="3222" w:type="dxa"/>
-                  <w:shd w:val="clear" w:color="auto" w:fill="F2F2F2" w:themeFill="background1" w:themeFillShade="F2"/>
-                  <w:vAlign w:val="center"/>
-                </w:tcPr>
-                <w:p wp14:textId="77777777">
-                  <w:pPr>
-                    <w:jc w:val="center"/>
-                    <w:rPr>
-                      <w:sz w:val="20"/>
-                    </w:rPr>
-                  </w:pPr>
-                </w:p>
-              </w:tc>
-              <w:tc>
-                <w:tcPr>
-                  <w:tcW w:w="3402" w:type="dxa"/>
-                  <w:shd w:val="clear" w:color="auto" w:fill="F2F2F2" w:themeFill="background1" w:themeFillShade="F2"/>
-                  <w:vAlign w:val="center"/>
-                </w:tcPr>
-                <w:p wp14:textId="77777777">
-                  <w:pPr>
-                    <w:jc w:val="center"/>
-                    <w:rPr>
-                      <w:sz w:val="20"/>
-                    </w:rPr>
-                  </w:pPr>
-                </w:p>
-              </w:tc>
-            </w:tr>
-            <w:tr wp14:textId="77777777">
-              <w:tc>
-                <w:tcPr>
-                  <w:tcW w:w="742" w:type="dxa"/>
-                  <w:vAlign w:val="center"/>
-                </w:tcPr>
-                <w:p wp14:textId="77777777">
-                  <w:pPr>
-                    <w:jc w:val="center"/>
-                    <w:rPr>
-                      <w:sz w:val="20"/>
-                    </w:rPr>
-                  </w:pPr>
-                </w:p>
-              </w:tc>
-              <w:tc>
-                <w:tcPr>
-                  <w:tcW w:w="3222" w:type="dxa"/>
-                  <w:vAlign w:val="center"/>
-                </w:tcPr>
-                <w:p wp14:textId="77777777">
-                  <w:pPr>
-                    <w:jc w:val="center"/>
-                    <w:rPr>
-                      <w:sz w:val="20"/>
-                    </w:rPr>
-                  </w:pPr>
-                </w:p>
-              </w:tc>
-              <w:tc>
-                <w:tcPr>
-                  <w:tcW w:w="3402" w:type="dxa"/>
-                  <w:vAlign w:val="center"/>
-                </w:tcPr>
-                <w:p wp14:textId="77777777">
-                  <w:pPr>
-                    <w:jc w:val="center"/>
-                    <w:rPr>
-                      <w:sz w:val="20"/>
-                    </w:rPr>
-                  </w:pPr>
-                </w:p>
-              </w:tc>
-            </w:tr>
-            <w:tr wp14:textId="77777777">
-              <w:tc>
-                <w:tcPr>
-                  <w:tcW w:w="742" w:type="dxa"/>
-                  <w:shd w:val="clear" w:color="auto" w:fill="F2F2F2" w:themeFill="background1" w:themeFillShade="F2"/>
-                  <w:vAlign w:val="center"/>
-                </w:tcPr>
-                <w:p wp14:textId="77777777">
-                  <w:pPr>
-                    <w:jc w:val="center"/>
-                    <w:rPr>
-                      <w:sz w:val="20"/>
-                    </w:rPr>
-                  </w:pPr>
-                </w:p>
-              </w:tc>
-              <w:tc>
-                <w:tcPr>
-                  <w:tcW w:w="3222" w:type="dxa"/>
-                  <w:shd w:val="clear" w:color="auto" w:fill="F2F2F2" w:themeFill="background1" w:themeFillShade="F2"/>
-                  <w:vAlign w:val="center"/>
-                </w:tcPr>
-                <w:p wp14:textId="77777777">
-                  <w:pPr>
-                    <w:jc w:val="center"/>
-                    <w:rPr>
-                      <w:sz w:val="20"/>
-                    </w:rPr>
-                  </w:pPr>
-                </w:p>
-              </w:tc>
-              <w:tc>
-                <w:tcPr>
-                  <w:tcW w:w="3402" w:type="dxa"/>
-                  <w:shd w:val="clear" w:color="auto" w:fill="F2F2F2" w:themeFill="background1" w:themeFillShade="F2"/>
-                  <w:vAlign w:val="center"/>
-                </w:tcPr>
-                <w:p wp14:textId="77777777">
-                  <w:pPr>
-                    <w:jc w:val="center"/>
-                    <w:rPr>
-                      <w:sz w:val="20"/>
-                    </w:rPr>
-                  </w:pPr>
-                </w:p>
-              </w:tc>
-            </w:tr>
-            <w:tr wp14:textId="77777777">
-              <w:tc>
-                <w:tcPr>
-                  <w:tcW w:w="742" w:type="dxa"/>
-                  <w:vAlign w:val="center"/>
-                </w:tcPr>
-                <w:p wp14:textId="77777777">
-                  <w:pPr>
-                    <w:jc w:val="center"/>
-                    <w:rPr>
-                      <w:sz w:val="20"/>
-                    </w:rPr>
-                  </w:pPr>
-                </w:p>
-              </w:tc>
-              <w:tc>
-                <w:tcPr>
-                  <w:tcW w:w="3222" w:type="dxa"/>
-                  <w:vAlign w:val="center"/>
-                </w:tcPr>
-                <w:p wp14:textId="77777777">
-                  <w:pPr>
-                    <w:jc w:val="center"/>
-                    <w:rPr>
-                      <w:sz w:val="20"/>
-                    </w:rPr>
-                  </w:pPr>
-                </w:p>
-              </w:tc>
-              <w:tc>
-                <w:tcPr>
-                  <w:tcW w:w="3402" w:type="dxa"/>
-                  <w:vAlign w:val="center"/>
-                </w:tcPr>
-                <w:p wp14:textId="77777777">
-                  <w:pPr>
-                    <w:jc w:val="center"/>
-                    <w:rPr>
-                      <w:sz w:val="20"/>
-                    </w:rPr>
-                  </w:pPr>
-                </w:p>
-              </w:tc>
-            </w:tr>
-            <w:tr wp14:textId="77777777">
-              <w:tc>
-                <w:tcPr>
-                  <w:tcW w:w="742" w:type="dxa"/>
-                  <w:shd w:val="clear" w:color="auto" w:fill="F2F2F2" w:themeFill="background1" w:themeFillShade="F2"/>
-                  <w:vAlign w:val="center"/>
-                </w:tcPr>
-                <w:p wp14:textId="77777777">
-                  <w:pPr>
-                    <w:jc w:val="center"/>
-                    <w:rPr>
-                      <w:sz w:val="20"/>
-                    </w:rPr>
-                  </w:pPr>
-                </w:p>
-              </w:tc>
-              <w:tc>
-                <w:tcPr>
-                  <w:tcW w:w="3222" w:type="dxa"/>
-                  <w:shd w:val="clear" w:color="auto" w:fill="F2F2F2" w:themeFill="background1" w:themeFillShade="F2"/>
-                  <w:vAlign w:val="center"/>
-                </w:tcPr>
-                <w:p wp14:textId="77777777">
-                  <w:pPr>
-                    <w:jc w:val="center"/>
-                    <w:rPr>
-                      <w:sz w:val="20"/>
-                    </w:rPr>
-                  </w:pPr>
-                </w:p>
-              </w:tc>
-              <w:tc>
-                <w:tcPr>
-                  <w:tcW w:w="3402" w:type="dxa"/>
-                  <w:shd w:val="clear" w:color="auto" w:fill="F2F2F2" w:themeFill="background1" w:themeFillShade="F2"/>
-                  <w:vAlign w:val="center"/>
-                </w:tcPr>
-                <w:p wp14:textId="77777777">
-                  <w:pPr>
-                    <w:jc w:val="center"/>
-                    <w:rPr>
-                      <w:sz w:val="20"/>
-                    </w:rPr>
-                  </w:pPr>
+                  <w:r>
+                    <w:rPr>
+                      <w:sz w:val="20"/>
+                      <w:szCs w:val="20"/>
+                    </w:rPr>
+                    <w:t xml:space="preserve">O </w:t>
+                  </w:r>
+                  <w:proofErr w:type="spellStart"/>
+                  <w:r>
+                    <w:rPr>
+                      <w:sz w:val="20"/>
+                      <w:szCs w:val="20"/>
+                    </w:rPr>
+                    <w:t>tester</w:t>
+                  </w:r>
+                  <w:proofErr w:type="spellEnd"/>
+                  <w:r>
+                    <w:rPr>
+                      <w:sz w:val="20"/>
+                      <w:szCs w:val="20"/>
+                    </w:rPr>
+                    <w:t xml:space="preserve"> deve conseguir executar esses passos sem ajuda de alguém que conheça como o software funciona, e não deve ocorrer nenhum erro.</w:t>
+                  </w:r>
                 </w:p>
               </w:tc>
             </w:tr>
           </w:tbl>
-          <w:p wp14:textId="77777777">
+          <w:p>
             <w:pPr>
               <w:rPr>
                 <w:sz w:val="20"/>
@@ -3529,11 +3688,11 @@
         </w:tc>
       </w:tr>
     </w:tbl>
-    <w:p xmlns:wp14="http://schemas.microsoft.com/office/word/2010/wordml" wp14:textId="77777777"/>
+    <w:p/>
     <w:sectPr>
-      <w:headerReference w:type="default" r:id="rId6"/>
-      <w:footerReference w:type="default" r:id="rId7"/>
-      <w:pgSz w:w="11906" w:h="16838" w:orient="portrait"/>
+      <w:headerReference w:type="default" r:id="rId7"/>
+      <w:footerReference w:type="default" r:id="rId8"/>
+      <w:pgSz w:w="11906" w:h="16838"/>
       <w:pgMar w:top="1417" w:right="1701" w:bottom="1417" w:left="1701" w:header="708" w:footer="708" w:gutter="0"/>
       <w:cols w:space="708"/>
       <w:docGrid w:linePitch="360"/>
@@ -3543,9 +3702,9 @@
 </file>
 
 <file path=word/endnotes.xml><?xml version="1.0" encoding="utf-8"?>
-<w:endnotes xmlns:wpc="http://schemas.microsoft.com/office/word/2010/wordprocessingCanvas" xmlns:cx="http://schemas.microsoft.com/office/drawing/2014/chartex" xmlns:cx1="http://schemas.microsoft.com/office/drawing/2015/9/8/chartex" xmlns:cx2="http://schemas.microsoft.com/office/drawing/2015/10/21/chartex" xmlns:cx3="http://schemas.microsoft.com/office/drawing/2016/5/9/chartex" xmlns:cx4="http://schemas.microsoft.com/office/drawing/2016/5/10/chartex" xmlns:cx5="http://schemas.microsoft.com/office/drawing/2016/5/11/chartex" xmlns:cx6="http://schemas.microsoft.com/office/drawing/2016/5/12/chartex" xmlns:cx7="http://schemas.microsoft.com/office/drawing/2016/5/13/chartex" xmlns:cx8="http://schemas.microsoft.com/office/drawing/2016/5/14/chartex" xmlns:mc="http://schemas.openxmlformats.org/markup-compatibility/2006" xmlns:aink="http://schemas.microsoft.com/office/drawing/2016/ink" xmlns:am3d="http://schemas.microsoft.com/office/drawing/2017/model3d" xmlns:o="urn:schemas-microsoft-com:office:office" xmlns:r="http://schemas.openxmlformats.org/officeDocument/2006/relationships" xmlns:m="http://schemas.openxmlformats.org/officeDocument/2006/math" xmlns:v="urn:schemas-microsoft-com:vml" xmlns:wp14="http://schemas.microsoft.com/office/word/2010/wordprocessingDrawing" xmlns:wp="http://schemas.openxmlformats.org/drawingml/2006/wordprocessingDrawing" xmlns:w10="urn:schemas-microsoft-com:office:word" xmlns:w="http://schemas.openxmlformats.org/wordprocessingml/2006/main" xmlns:w14="http://schemas.microsoft.com/office/word/2010/wordml" xmlns:w15="http://schemas.microsoft.com/office/word/2012/wordml" xmlns:w16cid="http://schemas.microsoft.com/office/word/2016/wordml/cid" xmlns:w16se="http://schemas.microsoft.com/office/word/2015/wordml/symex" xmlns:wpg="http://schemas.microsoft.com/office/word/2010/wordprocessingGroup" xmlns:wpi="http://schemas.microsoft.com/office/word/2010/wordprocessingInk" xmlns:wne="http://schemas.microsoft.com/office/word/2006/wordml" xmlns:wps="http://schemas.microsoft.com/office/word/2010/wordprocessingShape" mc:Ignorable="w14 w15 w16se w16cid wp14">
+<w:endnotes xmlns:wpc="http://schemas.microsoft.com/office/word/2010/wordprocessingCanvas" xmlns:cx="http://schemas.microsoft.com/office/drawing/2014/chartex" xmlns:cx1="http://schemas.microsoft.com/office/drawing/2015/9/8/chartex" xmlns:cx2="http://schemas.microsoft.com/office/drawing/2015/10/21/chartex" xmlns:cx3="http://schemas.microsoft.com/office/drawing/2016/5/9/chartex" xmlns:cx4="http://schemas.microsoft.com/office/drawing/2016/5/10/chartex" xmlns:cx5="http://schemas.microsoft.com/office/drawing/2016/5/11/chartex" xmlns:cx6="http://schemas.microsoft.com/office/drawing/2016/5/12/chartex" xmlns:cx7="http://schemas.microsoft.com/office/drawing/2016/5/13/chartex" xmlns:cx8="http://schemas.microsoft.com/office/drawing/2016/5/14/chartex" xmlns:mc="http://schemas.openxmlformats.org/markup-compatibility/2006" xmlns:aink="http://schemas.microsoft.com/office/drawing/2016/ink" xmlns:am3d="http://schemas.microsoft.com/office/drawing/2017/model3d" xmlns:o="urn:schemas-microsoft-com:office:office" xmlns:r="http://schemas.openxmlformats.org/officeDocument/2006/relationships" xmlns:m="http://schemas.openxmlformats.org/officeDocument/2006/math" xmlns:v="urn:schemas-microsoft-com:vml" xmlns:wp14="http://schemas.microsoft.com/office/word/2010/wordprocessingDrawing" xmlns:wp="http://schemas.openxmlformats.org/drawingml/2006/wordprocessingDrawing" xmlns:w10="urn:schemas-microsoft-com:office:word" xmlns:w="http://schemas.openxmlformats.org/wordprocessingml/2006/main" xmlns:w14="http://schemas.microsoft.com/office/word/2010/wordml" xmlns:w15="http://schemas.microsoft.com/office/word/2012/wordml" xmlns:w16cex="http://schemas.microsoft.com/office/word/2018/wordml/cex" xmlns:w16cid="http://schemas.microsoft.com/office/word/2016/wordml/cid" xmlns:w16="http://schemas.microsoft.com/office/word/2018/wordml" xmlns:w16sdtdh="http://schemas.microsoft.com/office/word/2020/wordml/sdtdatahash" xmlns:w16se="http://schemas.microsoft.com/office/word/2015/wordml/symex" xmlns:wpg="http://schemas.microsoft.com/office/word/2010/wordprocessingGroup" xmlns:wpi="http://schemas.microsoft.com/office/word/2010/wordprocessingInk" xmlns:wne="http://schemas.microsoft.com/office/word/2006/wordml" xmlns:wps="http://schemas.microsoft.com/office/word/2010/wordprocessingShape" mc:Ignorable="w14 w15 w16se w16cid w16 w16cex w16sdtdh wp14">
   <w:endnote w:type="separator" w:id="-1">
-    <w:p xmlns:wp14="http://schemas.microsoft.com/office/word/2010/wordml" wp14:textId="77777777">
+    <w:p>
       <w:pPr>
         <w:spacing w:after="0" w:line="240" w:lineRule="auto"/>
       </w:pPr>
@@ -3555,7 +3714,7 @@
     </w:p>
   </w:endnote>
   <w:endnote w:type="continuationSeparator" w:id="0">
-    <w:p xmlns:wp14="http://schemas.microsoft.com/office/word/2010/wordml" wp14:textId="77777777">
+    <w:p>
       <w:pPr>
         <w:spacing w:after="0" w:line="240" w:lineRule="auto"/>
       </w:pPr>
@@ -3568,8 +3727,8 @@
 </file>
 
 <file path=word/footer1.xml><?xml version="1.0" encoding="utf-8"?>
-<w:ftr xmlns:wpc="http://schemas.microsoft.com/office/word/2010/wordprocessingCanvas" xmlns:cx="http://schemas.microsoft.com/office/drawing/2014/chartex" xmlns:cx1="http://schemas.microsoft.com/office/drawing/2015/9/8/chartex" xmlns:cx2="http://schemas.microsoft.com/office/drawing/2015/10/21/chartex" xmlns:cx3="http://schemas.microsoft.com/office/drawing/2016/5/9/chartex" xmlns:cx4="http://schemas.microsoft.com/office/drawing/2016/5/10/chartex" xmlns:cx5="http://schemas.microsoft.com/office/drawing/2016/5/11/chartex" xmlns:cx6="http://schemas.microsoft.com/office/drawing/2016/5/12/chartex" xmlns:cx7="http://schemas.microsoft.com/office/drawing/2016/5/13/chartex" xmlns:cx8="http://schemas.microsoft.com/office/drawing/2016/5/14/chartex" xmlns:mc="http://schemas.openxmlformats.org/markup-compatibility/2006" xmlns:aink="http://schemas.microsoft.com/office/drawing/2016/ink" xmlns:am3d="http://schemas.microsoft.com/office/drawing/2017/model3d" xmlns:o="urn:schemas-microsoft-com:office:office" xmlns:r="http://schemas.openxmlformats.org/officeDocument/2006/relationships" xmlns:m="http://schemas.openxmlformats.org/officeDocument/2006/math" xmlns:v="urn:schemas-microsoft-com:vml" xmlns:wp14="http://schemas.microsoft.com/office/word/2010/wordprocessingDrawing" xmlns:wp="http://schemas.openxmlformats.org/drawingml/2006/wordprocessingDrawing" xmlns:w10="urn:schemas-microsoft-com:office:word" xmlns:w="http://schemas.openxmlformats.org/wordprocessingml/2006/main" xmlns:w14="http://schemas.microsoft.com/office/word/2010/wordml" xmlns:w15="http://schemas.microsoft.com/office/word/2012/wordml" xmlns:w16cid="http://schemas.microsoft.com/office/word/2016/wordml/cid" xmlns:w16se="http://schemas.microsoft.com/office/word/2015/wordml/symex" xmlns:wpg="http://schemas.microsoft.com/office/word/2010/wordprocessingGroup" xmlns:wpi="http://schemas.microsoft.com/office/word/2010/wordprocessingInk" xmlns:wne="http://schemas.microsoft.com/office/word/2006/wordml" xmlns:wps="http://schemas.microsoft.com/office/word/2010/wordprocessingShape" mc:Ignorable="w14 w15 w16se w16cid wp14">
-  <w:p xmlns:wp14="http://schemas.microsoft.com/office/word/2010/wordml" wp14:textId="77777777">
+<w:ftr xmlns:wpc="http://schemas.microsoft.com/office/word/2010/wordprocessingCanvas" xmlns:cx="http://schemas.microsoft.com/office/drawing/2014/chartex" xmlns:cx1="http://schemas.microsoft.com/office/drawing/2015/9/8/chartex" xmlns:cx2="http://schemas.microsoft.com/office/drawing/2015/10/21/chartex" xmlns:cx3="http://schemas.microsoft.com/office/drawing/2016/5/9/chartex" xmlns:cx4="http://schemas.microsoft.com/office/drawing/2016/5/10/chartex" xmlns:cx5="http://schemas.microsoft.com/office/drawing/2016/5/11/chartex" xmlns:cx6="http://schemas.microsoft.com/office/drawing/2016/5/12/chartex" xmlns:cx7="http://schemas.microsoft.com/office/drawing/2016/5/13/chartex" xmlns:cx8="http://schemas.microsoft.com/office/drawing/2016/5/14/chartex" xmlns:mc="http://schemas.openxmlformats.org/markup-compatibility/2006" xmlns:aink="http://schemas.microsoft.com/office/drawing/2016/ink" xmlns:am3d="http://schemas.microsoft.com/office/drawing/2017/model3d" xmlns:o="urn:schemas-microsoft-com:office:office" xmlns:r="http://schemas.openxmlformats.org/officeDocument/2006/relationships" xmlns:m="http://schemas.openxmlformats.org/officeDocument/2006/math" xmlns:v="urn:schemas-microsoft-com:vml" xmlns:wp14="http://schemas.microsoft.com/office/word/2010/wordprocessingDrawing" xmlns:wp="http://schemas.openxmlformats.org/drawingml/2006/wordprocessingDrawing" xmlns:w10="urn:schemas-microsoft-com:office:word" xmlns:w="http://schemas.openxmlformats.org/wordprocessingml/2006/main" xmlns:w14="http://schemas.microsoft.com/office/word/2010/wordml" xmlns:w15="http://schemas.microsoft.com/office/word/2012/wordml" xmlns:w16cex="http://schemas.microsoft.com/office/word/2018/wordml/cex" xmlns:w16cid="http://schemas.microsoft.com/office/word/2016/wordml/cid" xmlns:w16="http://schemas.microsoft.com/office/word/2018/wordml" xmlns:w16sdtdh="http://schemas.microsoft.com/office/word/2020/wordml/sdtdatahash" xmlns:w16se="http://schemas.microsoft.com/office/word/2015/wordml/symex" xmlns:wpg="http://schemas.microsoft.com/office/word/2010/wordprocessingGroup" xmlns:wpi="http://schemas.microsoft.com/office/word/2010/wordprocessingInk" xmlns:wne="http://schemas.microsoft.com/office/word/2006/wordml" xmlns:wps="http://schemas.microsoft.com/office/word/2010/wordprocessingShape" mc:Ignorable="w14 w15 w16se w16cid w16 w16cex w16sdtdh wp14">
+  <w:p>
     <w:pPr>
       <w:pStyle w:val="Rodap"/>
       <w:jc w:val="center"/>
@@ -3747,9 +3906,9 @@
 </file>
 
 <file path=word/footnotes.xml><?xml version="1.0" encoding="utf-8"?>
-<w:footnotes xmlns:wpc="http://schemas.microsoft.com/office/word/2010/wordprocessingCanvas" xmlns:cx="http://schemas.microsoft.com/office/drawing/2014/chartex" xmlns:cx1="http://schemas.microsoft.com/office/drawing/2015/9/8/chartex" xmlns:cx2="http://schemas.microsoft.com/office/drawing/2015/10/21/chartex" xmlns:cx3="http://schemas.microsoft.com/office/drawing/2016/5/9/chartex" xmlns:cx4="http://schemas.microsoft.com/office/drawing/2016/5/10/chartex" xmlns:cx5="http://schemas.microsoft.com/office/drawing/2016/5/11/chartex" xmlns:cx6="http://schemas.microsoft.com/office/drawing/2016/5/12/chartex" xmlns:cx7="http://schemas.microsoft.com/office/drawing/2016/5/13/chartex" xmlns:cx8="http://schemas.microsoft.com/office/drawing/2016/5/14/chartex" xmlns:mc="http://schemas.openxmlformats.org/markup-compatibility/2006" xmlns:aink="http://schemas.microsoft.com/office/drawing/2016/ink" xmlns:am3d="http://schemas.microsoft.com/office/drawing/2017/model3d" xmlns:o="urn:schemas-microsoft-com:office:office" xmlns:r="http://schemas.openxmlformats.org/officeDocument/2006/relationships" xmlns:m="http://schemas.openxmlformats.org/officeDocument/2006/math" xmlns:v="urn:schemas-microsoft-com:vml" xmlns:wp14="http://schemas.microsoft.com/office/word/2010/wordprocessingDrawing" xmlns:wp="http://schemas.openxmlformats.org/drawingml/2006/wordprocessingDrawing" xmlns:w10="urn:schemas-microsoft-com:office:word" xmlns:w="http://schemas.openxmlformats.org/wordprocessingml/2006/main" xmlns:w14="http://schemas.microsoft.com/office/word/2010/wordml" xmlns:w15="http://schemas.microsoft.com/office/word/2012/wordml" xmlns:w16cid="http://schemas.microsoft.com/office/word/2016/wordml/cid" xmlns:w16se="http://schemas.microsoft.com/office/word/2015/wordml/symex" xmlns:wpg="http://schemas.microsoft.com/office/word/2010/wordprocessingGroup" xmlns:wpi="http://schemas.microsoft.com/office/word/2010/wordprocessingInk" xmlns:wne="http://schemas.microsoft.com/office/word/2006/wordml" xmlns:wps="http://schemas.microsoft.com/office/word/2010/wordprocessingShape" mc:Ignorable="w14 w15 w16se w16cid wp14">
+<w:footnotes xmlns:wpc="http://schemas.microsoft.com/office/word/2010/wordprocessingCanvas" xmlns:cx="http://schemas.microsoft.com/office/drawing/2014/chartex" xmlns:cx1="http://schemas.microsoft.com/office/drawing/2015/9/8/chartex" xmlns:cx2="http://schemas.microsoft.com/office/drawing/2015/10/21/chartex" xmlns:cx3="http://schemas.microsoft.com/office/drawing/2016/5/9/chartex" xmlns:cx4="http://schemas.microsoft.com/office/drawing/2016/5/10/chartex" xmlns:cx5="http://schemas.microsoft.com/office/drawing/2016/5/11/chartex" xmlns:cx6="http://schemas.microsoft.com/office/drawing/2016/5/12/chartex" xmlns:cx7="http://schemas.microsoft.com/office/drawing/2016/5/13/chartex" xmlns:cx8="http://schemas.microsoft.com/office/drawing/2016/5/14/chartex" xmlns:mc="http://schemas.openxmlformats.org/markup-compatibility/2006" xmlns:aink="http://schemas.microsoft.com/office/drawing/2016/ink" xmlns:am3d="http://schemas.microsoft.com/office/drawing/2017/model3d" xmlns:o="urn:schemas-microsoft-com:office:office" xmlns:r="http://schemas.openxmlformats.org/officeDocument/2006/relationships" xmlns:m="http://schemas.openxmlformats.org/officeDocument/2006/math" xmlns:v="urn:schemas-microsoft-com:vml" xmlns:wp14="http://schemas.microsoft.com/office/word/2010/wordprocessingDrawing" xmlns:wp="http://schemas.openxmlformats.org/drawingml/2006/wordprocessingDrawing" xmlns:w10="urn:schemas-microsoft-com:office:word" xmlns:w="http://schemas.openxmlformats.org/wordprocessingml/2006/main" xmlns:w14="http://schemas.microsoft.com/office/word/2010/wordml" xmlns:w15="http://schemas.microsoft.com/office/word/2012/wordml" xmlns:w16cex="http://schemas.microsoft.com/office/word/2018/wordml/cex" xmlns:w16cid="http://schemas.microsoft.com/office/word/2016/wordml/cid" xmlns:w16="http://schemas.microsoft.com/office/word/2018/wordml" xmlns:w16sdtdh="http://schemas.microsoft.com/office/word/2020/wordml/sdtdatahash" xmlns:w16se="http://schemas.microsoft.com/office/word/2015/wordml/symex" xmlns:wpg="http://schemas.microsoft.com/office/word/2010/wordprocessingGroup" xmlns:wpi="http://schemas.microsoft.com/office/word/2010/wordprocessingInk" xmlns:wne="http://schemas.microsoft.com/office/word/2006/wordml" xmlns:wps="http://schemas.microsoft.com/office/word/2010/wordprocessingShape" mc:Ignorable="w14 w15 w16se w16cid w16 w16cex w16sdtdh wp14">
   <w:footnote w:type="separator" w:id="-1">
-    <w:p xmlns:wp14="http://schemas.microsoft.com/office/word/2010/wordml" wp14:textId="77777777">
+    <w:p>
       <w:pPr>
         <w:spacing w:after="0" w:line="240" w:lineRule="auto"/>
       </w:pPr>
@@ -3759,7 +3918,7 @@
     </w:p>
   </w:footnote>
   <w:footnote w:type="continuationSeparator" w:id="0">
-    <w:p xmlns:wp14="http://schemas.microsoft.com/office/word/2010/wordml" wp14:textId="77777777">
+    <w:p>
       <w:pPr>
         <w:spacing w:after="0" w:line="240" w:lineRule="auto"/>
       </w:pPr>
@@ -3772,18 +3931,18 @@
 </file>
 
 <file path=word/header1.xml><?xml version="1.0" encoding="utf-8"?>
-<w:hdr xmlns:wpc="http://schemas.microsoft.com/office/word/2010/wordprocessingCanvas" xmlns:cx="http://schemas.microsoft.com/office/drawing/2014/chartex" xmlns:cx1="http://schemas.microsoft.com/office/drawing/2015/9/8/chartex" xmlns:cx2="http://schemas.microsoft.com/office/drawing/2015/10/21/chartex" xmlns:cx3="http://schemas.microsoft.com/office/drawing/2016/5/9/chartex" xmlns:cx4="http://schemas.microsoft.com/office/drawing/2016/5/10/chartex" xmlns:cx5="http://schemas.microsoft.com/office/drawing/2016/5/11/chartex" xmlns:cx6="http://schemas.microsoft.com/office/drawing/2016/5/12/chartex" xmlns:cx7="http://schemas.microsoft.com/office/drawing/2016/5/13/chartex" xmlns:cx8="http://schemas.microsoft.com/office/drawing/2016/5/14/chartex" xmlns:mc="http://schemas.openxmlformats.org/markup-compatibility/2006" xmlns:aink="http://schemas.microsoft.com/office/drawing/2016/ink" xmlns:am3d="http://schemas.microsoft.com/office/drawing/2017/model3d" xmlns:o="urn:schemas-microsoft-com:office:office" xmlns:r="http://schemas.openxmlformats.org/officeDocument/2006/relationships" xmlns:m="http://schemas.openxmlformats.org/officeDocument/2006/math" xmlns:v="urn:schemas-microsoft-com:vml" xmlns:wp14="http://schemas.microsoft.com/office/word/2010/wordprocessingDrawing" xmlns:wp="http://schemas.openxmlformats.org/drawingml/2006/wordprocessingDrawing" xmlns:w10="urn:schemas-microsoft-com:office:word" xmlns:w="http://schemas.openxmlformats.org/wordprocessingml/2006/main" xmlns:w14="http://schemas.microsoft.com/office/word/2010/wordml" xmlns:w15="http://schemas.microsoft.com/office/word/2012/wordml" xmlns:w16cid="http://schemas.microsoft.com/office/word/2016/wordml/cid" xmlns:w16se="http://schemas.microsoft.com/office/word/2015/wordml/symex" xmlns:wpg="http://schemas.microsoft.com/office/word/2010/wordprocessingGroup" xmlns:wpi="http://schemas.microsoft.com/office/word/2010/wordprocessingInk" xmlns:wne="http://schemas.microsoft.com/office/word/2006/wordml" xmlns:wps="http://schemas.microsoft.com/office/word/2010/wordprocessingShape" xmlns:a="http://schemas.openxmlformats.org/drawingml/2006/main" xmlns:pic="http://schemas.openxmlformats.org/drawingml/2006/picture" xmlns:a14="http://schemas.microsoft.com/office/drawing/2010/main" mc:Ignorable="w14 w15 w16se w16cid wp14">
+<w:hdr xmlns:wpc="http://schemas.microsoft.com/office/word/2010/wordprocessingCanvas" xmlns:cx="http://schemas.microsoft.com/office/drawing/2014/chartex" xmlns:cx1="http://schemas.microsoft.com/office/drawing/2015/9/8/chartex" xmlns:cx2="http://schemas.microsoft.com/office/drawing/2015/10/21/chartex" xmlns:cx3="http://schemas.microsoft.com/office/drawing/2016/5/9/chartex" xmlns:cx4="http://schemas.microsoft.com/office/drawing/2016/5/10/chartex" xmlns:cx5="http://schemas.microsoft.com/office/drawing/2016/5/11/chartex" xmlns:cx6="http://schemas.microsoft.com/office/drawing/2016/5/12/chartex" xmlns:cx7="http://schemas.microsoft.com/office/drawing/2016/5/13/chartex" xmlns:cx8="http://schemas.microsoft.com/office/drawing/2016/5/14/chartex" xmlns:mc="http://schemas.openxmlformats.org/markup-compatibility/2006" xmlns:aink="http://schemas.microsoft.com/office/drawing/2016/ink" xmlns:am3d="http://schemas.microsoft.com/office/drawing/2017/model3d" xmlns:o="urn:schemas-microsoft-com:office:office" xmlns:r="http://schemas.openxmlformats.org/officeDocument/2006/relationships" xmlns:m="http://schemas.openxmlformats.org/officeDocument/2006/math" xmlns:v="urn:schemas-microsoft-com:vml" xmlns:wp14="http://schemas.microsoft.com/office/word/2010/wordprocessingDrawing" xmlns:wp="http://schemas.openxmlformats.org/drawingml/2006/wordprocessingDrawing" xmlns:w10="urn:schemas-microsoft-com:office:word" xmlns:w="http://schemas.openxmlformats.org/wordprocessingml/2006/main" xmlns:w14="http://schemas.microsoft.com/office/word/2010/wordml" xmlns:w15="http://schemas.microsoft.com/office/word/2012/wordml" xmlns:w16cex="http://schemas.microsoft.com/office/word/2018/wordml/cex" xmlns:w16cid="http://schemas.microsoft.com/office/word/2016/wordml/cid" xmlns:w16="http://schemas.microsoft.com/office/word/2018/wordml" xmlns:w16sdtdh="http://schemas.microsoft.com/office/word/2020/wordml/sdtdatahash" xmlns:w16se="http://schemas.microsoft.com/office/word/2015/wordml/symex" xmlns:wpg="http://schemas.microsoft.com/office/word/2010/wordprocessingGroup" xmlns:wpi="http://schemas.microsoft.com/office/word/2010/wordprocessingInk" xmlns:wne="http://schemas.microsoft.com/office/word/2006/wordml" xmlns:wps="http://schemas.microsoft.com/office/word/2010/wordprocessingShape" mc:Ignorable="w14 w15 w16se w16cid w16 w16cex w16sdtdh wp14">
   <w:tbl>
     <w:tblPr>
       <w:tblW w:w="9356" w:type="dxa"/>
       <w:tblInd w:w="-147" w:type="dxa"/>
       <w:tblBorders>
-        <w:top w:val="single" w:color="auto" w:sz="4" w:space="0"/>
-        <w:left w:val="single" w:color="auto" w:sz="4" w:space="0"/>
-        <w:bottom w:val="single" w:color="auto" w:sz="4" w:space="0"/>
-        <w:right w:val="single" w:color="auto" w:sz="4" w:space="0"/>
-        <w:insideH w:val="single" w:color="auto" w:sz="4" w:space="0"/>
-        <w:insideV w:val="single" w:color="auto" w:sz="4" w:space="0"/>
+        <w:top w:val="single" w:sz="4" w:space="0" w:color="auto"/>
+        <w:left w:val="single" w:sz="4" w:space="0" w:color="auto"/>
+        <w:bottom w:val="single" w:sz="4" w:space="0" w:color="auto"/>
+        <w:right w:val="single" w:sz="4" w:space="0" w:color="auto"/>
+        <w:insideH w:val="single" w:sz="4" w:space="0" w:color="auto"/>
+        <w:insideV w:val="single" w:sz="4" w:space="0" w:color="auto"/>
       </w:tblBorders>
       <w:tblLook w:val="01E0" w:firstRow="1" w:lastRow="1" w:firstColumn="1" w:lastColumn="1" w:noHBand="0" w:noVBand="0"/>
     </w:tblPr>
@@ -3793,7 +3952,7 @@
       <w:gridCol w:w="1075"/>
       <w:gridCol w:w="3177"/>
     </w:tblGrid>
-    <w:tr xmlns:wp14="http://schemas.microsoft.com/office/word/2010/wordml" wp14:textId="77777777">
+    <w:tr>
       <w:trPr>
         <w:trHeight w:val="390"/>
       </w:trPr>
@@ -3801,10 +3960,9 @@
         <w:tcPr>
           <w:tcW w:w="3569" w:type="dxa"/>
           <w:vMerge w:val="restart"/>
-          <w:tcMar/>
           <w:vAlign w:val="center"/>
         </w:tcPr>
-        <w:p wp14:textId="77777777">
+        <w:p>
           <w:pPr>
             <w:pStyle w:val="Cabealho"/>
             <w:jc w:val="center"/>
@@ -3814,7 +3972,7 @@
               <w:noProof/>
             </w:rPr>
             <w:drawing>
-              <wp:inline xmlns:wp14="http://schemas.microsoft.com/office/word/2010/wordprocessingDrawing" distT="0" distB="0" distL="0" distR="0" wp14:anchorId="4202A81A" wp14:editId="7AF7D238">
+              <wp:inline distT="0" distB="0" distL="0" distR="0" wp14:anchorId="4202A81A" wp14:editId="7AF7D238">
                 <wp:extent cx="1919288" cy="489482"/>
                 <wp:effectExtent l="0" t="0" r="5080" b="6350"/>
                 <wp:docPr id="6" name="Imagem 6" descr="http://www.cursolideranca.com.br/wp-content/uploads/2015/11/logo-senai.jpg"/>
@@ -3868,10 +4026,9 @@
         <w:tcPr>
           <w:tcW w:w="2610" w:type="dxa"/>
           <w:gridSpan w:val="2"/>
-          <w:tcMar/>
           <w:vAlign w:val="center"/>
         </w:tcPr>
-        <w:p wp14:textId="77777777">
+        <w:p>
           <w:pPr>
             <w:pStyle w:val="Cabealho"/>
             <w:jc w:val="center"/>
@@ -3897,10 +4054,9 @@
         <w:tcPr>
           <w:tcW w:w="3177" w:type="dxa"/>
           <w:vMerge w:val="restart"/>
-          <w:tcMar/>
           <w:vAlign w:val="center"/>
         </w:tcPr>
-        <w:p wp14:textId="77777777">
+        <w:p>
           <w:pPr>
             <w:pStyle w:val="Cabealho"/>
             <w:jc w:val="center"/>
@@ -3959,7 +4115,7 @@
         </w:p>
       </w:tc>
     </w:tr>
-    <w:tr xmlns:wp14="http://schemas.microsoft.com/office/word/2010/wordml" wp14:textId="77777777">
+    <w:tr>
       <w:trPr>
         <w:trHeight w:val="390"/>
       </w:trPr>
@@ -3967,10 +4123,9 @@
         <w:tcPr>
           <w:tcW w:w="3569" w:type="dxa"/>
           <w:vMerge/>
-          <w:tcMar/>
           <w:vAlign w:val="center"/>
         </w:tcPr>
-        <w:p wp14:textId="77777777">
+        <w:p>
           <w:pPr>
             <w:pStyle w:val="Cabealho"/>
             <w:jc w:val="center"/>
@@ -3984,16 +4139,11 @@
         <w:tcPr>
           <w:tcW w:w="2610" w:type="dxa"/>
           <w:gridSpan w:val="2"/>
-          <w:tcMar/>
           <w:vAlign w:val="center"/>
         </w:tcPr>
-        <w:p wp14:textId="39012C43">
+        <w:p>
           <w:pPr>
             <w:pStyle w:val="Cabealho"/>
-            <w:suppressLineNumbers w:val="0"/>
-            <w:bidi w:val="0"/>
-            <w:spacing w:before="0" w:beforeAutospacing="off" w:after="0" w:afterAutospacing="off" w:line="240" w:lineRule="auto"/>
-            <w:ind w:left="0" w:right="0"/>
             <w:jc w:val="center"/>
           </w:pPr>
           <w:r>
@@ -4008,10 +4158,9 @@
         <w:tcPr>
           <w:tcW w:w="3177" w:type="dxa"/>
           <w:vMerge/>
-          <w:tcMar/>
           <w:vAlign w:val="center"/>
         </w:tcPr>
-        <w:p wp14:textId="77777777">
+        <w:p>
           <w:pPr>
             <w:pStyle w:val="Cabealho"/>
             <w:jc w:val="center"/>
@@ -4022,17 +4171,16 @@
         </w:p>
       </w:tc>
     </w:tr>
-    <w:tr xmlns:wp14="http://schemas.microsoft.com/office/word/2010/wordml" wp14:textId="77777777">
+    <w:tr>
       <w:trPr>
         <w:trHeight w:val="315"/>
       </w:trPr>
       <w:tc>
         <w:tcPr>
           <w:tcW w:w="3569" w:type="dxa"/>
-          <w:tcMar/>
           <w:vAlign w:val="center"/>
         </w:tcPr>
-        <w:p wp14:textId="77777777">
+        <w:p>
           <w:pPr>
             <w:pStyle w:val="Cabealho"/>
             <w:jc w:val="center"/>
@@ -4057,10 +4205,9 @@
       <w:tc>
         <w:tcPr>
           <w:tcW w:w="1535" w:type="dxa"/>
-          <w:tcMar/>
           <w:vAlign w:val="center"/>
         </w:tcPr>
-        <w:p wp14:textId="0E1CD29C">
+        <w:p>
           <w:pPr>
             <w:pStyle w:val="Cabealho"/>
             <w:jc w:val="center"/>
@@ -4073,8 +4220,8 @@
           <w:r>
             <w:rPr>
               <w:rFonts w:ascii="Verdana" w:hAnsi="Verdana"/>
-              <w:b w:val="1"/>
-              <w:bCs w:val="1"/>
+              <w:b/>
+              <w:bCs/>
               <w:sz w:val="20"/>
               <w:szCs w:val="20"/>
             </w:rPr>
@@ -4086,15 +4233,7 @@
               <w:sz w:val="20"/>
               <w:szCs w:val="20"/>
             </w:rPr>
-            <w:t>: 0</w:t>
-          </w:r>
-          <w:r>
-            <w:rPr>
-              <w:rFonts w:ascii="Verdana" w:hAnsi="Verdana"/>
-              <w:sz w:val="20"/>
-              <w:szCs w:val="20"/>
-            </w:rPr>
-            <w:t>1</w:t>
+            <w:t>: 01</w:t>
           </w:r>
         </w:p>
       </w:tc>
@@ -4102,10 +4241,9 @@
         <w:tcPr>
           <w:tcW w:w="4252" w:type="dxa"/>
           <w:gridSpan w:val="2"/>
-          <w:tcMar/>
           <w:vAlign w:val="center"/>
         </w:tcPr>
-        <w:p wp14:textId="7C5D987A">
+        <w:p>
           <w:pPr>
             <w:pStyle w:val="Cabealho"/>
             <w:jc w:val="center"/>
@@ -4118,8 +4256,8 @@
           <w:r>
             <w:rPr>
               <w:rFonts w:ascii="Verdana" w:hAnsi="Verdana"/>
-              <w:b w:val="1"/>
-              <w:bCs w:val="1"/>
+              <w:b/>
+              <w:bCs/>
               <w:sz w:val="20"/>
               <w:szCs w:val="20"/>
             </w:rPr>
@@ -4131,53 +4269,13 @@
               <w:sz w:val="20"/>
               <w:szCs w:val="20"/>
             </w:rPr>
-            <w:t xml:space="preserve">: </w:t>
-          </w:r>
-          <w:r>
-            <w:rPr>
-              <w:rFonts w:ascii="Verdana" w:hAnsi="Verdana"/>
-              <w:sz w:val="20"/>
-              <w:szCs w:val="20"/>
-            </w:rPr>
-            <w:t>29</w:t>
-          </w:r>
-          <w:r>
-            <w:rPr>
-              <w:rFonts w:ascii="Verdana" w:hAnsi="Verdana"/>
-              <w:sz w:val="20"/>
-              <w:szCs w:val="20"/>
-            </w:rPr>
-            <w:t>/</w:t>
-          </w:r>
-          <w:r>
-            <w:rPr>
-              <w:rFonts w:ascii="Verdana" w:hAnsi="Verdana"/>
-              <w:sz w:val="20"/>
-              <w:szCs w:val="20"/>
-            </w:rPr>
-            <w:t>04</w:t>
-          </w:r>
-          <w:r>
-            <w:rPr>
-              <w:rFonts w:ascii="Verdana" w:hAnsi="Verdana"/>
-              <w:sz w:val="20"/>
-              <w:szCs w:val="20"/>
-            </w:rPr>
-            <w:t>/</w:t>
-          </w:r>
-          <w:r>
-            <w:rPr>
-              <w:rFonts w:ascii="Verdana" w:hAnsi="Verdana"/>
-              <w:sz w:val="20"/>
-              <w:szCs w:val="20"/>
-            </w:rPr>
-            <w:t>2026</w:t>
+            <w:t>: 29/04/2026</w:t>
           </w:r>
         </w:p>
       </w:tc>
     </w:tr>
   </w:tbl>
-  <w:p xmlns:wp14="http://schemas.microsoft.com/office/word/2010/wordml" wp14:textId="77777777">
+  <w:p>
     <w:pPr>
       <w:pStyle w:val="Cabealho"/>
     </w:pPr>
@@ -4186,11 +4284,12 @@
 </file>
 
 <file path=word/numbering.xml><?xml version="1.0" encoding="utf-8"?>
-<w:numbering xmlns:w="http://schemas.openxmlformats.org/wordprocessingml/2006/main">
-  <w:abstractNum xmlns:w="http://schemas.openxmlformats.org/wordprocessingml/2006/main" w:abstractNumId="1">
-    <w:nsid w:val="2105bc0a"/>
-    <w:multiLevelType xmlns:w="http://schemas.openxmlformats.org/wordprocessingml/2006/main" w:val="hybridMultilevel"/>
-    <w:lvl xmlns:w="http://schemas.openxmlformats.org/wordprocessingml/2006/main" w:ilvl="0">
+<w:numbering xmlns:wpc="http://schemas.microsoft.com/office/word/2010/wordprocessingCanvas" xmlns:cx="http://schemas.microsoft.com/office/drawing/2014/chartex" xmlns:cx1="http://schemas.microsoft.com/office/drawing/2015/9/8/chartex" xmlns:cx2="http://schemas.microsoft.com/office/drawing/2015/10/21/chartex" xmlns:cx3="http://schemas.microsoft.com/office/drawing/2016/5/9/chartex" xmlns:cx4="http://schemas.microsoft.com/office/drawing/2016/5/10/chartex" xmlns:cx5="http://schemas.microsoft.com/office/drawing/2016/5/11/chartex" xmlns:cx6="http://schemas.microsoft.com/office/drawing/2016/5/12/chartex" xmlns:cx7="http://schemas.microsoft.com/office/drawing/2016/5/13/chartex" xmlns:cx8="http://schemas.microsoft.com/office/drawing/2016/5/14/chartex" xmlns:mc="http://schemas.openxmlformats.org/markup-compatibility/2006" xmlns:aink="http://schemas.microsoft.com/office/drawing/2016/ink" xmlns:am3d="http://schemas.microsoft.com/office/drawing/2017/model3d" xmlns:o="urn:schemas-microsoft-com:office:office" xmlns:r="http://schemas.openxmlformats.org/officeDocument/2006/relationships" xmlns:m="http://schemas.openxmlformats.org/officeDocument/2006/math" xmlns:v="urn:schemas-microsoft-com:vml" xmlns:wp14="http://schemas.microsoft.com/office/word/2010/wordprocessingDrawing" xmlns:wp="http://schemas.openxmlformats.org/drawingml/2006/wordprocessingDrawing" xmlns:w10="urn:schemas-microsoft-com:office:word" xmlns:w="http://schemas.openxmlformats.org/wordprocessingml/2006/main" xmlns:w14="http://schemas.microsoft.com/office/word/2010/wordml" xmlns:w15="http://schemas.microsoft.com/office/word/2012/wordml" xmlns:w16cex="http://schemas.microsoft.com/office/word/2018/wordml/cex" xmlns:w16cid="http://schemas.microsoft.com/office/word/2016/wordml/cid" xmlns:w16="http://schemas.microsoft.com/office/word/2018/wordml" xmlns:w16sdtdh="http://schemas.microsoft.com/office/word/2020/wordml/sdtdatahash" xmlns:w16se="http://schemas.microsoft.com/office/word/2015/wordml/symex" xmlns:wpg="http://schemas.microsoft.com/office/word/2010/wordprocessingGroup" xmlns:wpi="http://schemas.microsoft.com/office/word/2010/wordprocessingInk" xmlns:wne="http://schemas.microsoft.com/office/word/2006/wordml" xmlns:wps="http://schemas.microsoft.com/office/word/2010/wordprocessingShape" mc:Ignorable="w14 w15 w16se w16cid w16 w16cex w16sdtdh wp14">
+  <w:abstractNum w:abstractNumId="0" w15:restartNumberingAfterBreak="0">
+    <w:nsid w:val="2105BC0A"/>
+    <w:multiLevelType w:val="hybridMultilevel"/>
+    <w:tmpl w:val="08C8657C"/>
+    <w:lvl w:ilvl="0" w:tplc="C1D81676">
       <w:start w:val="1"/>
       <w:numFmt w:val="decimal"/>
       <w:lvlText w:val="%1."/>
@@ -4199,7 +4298,7 @@
         <w:ind w:left="720" w:hanging="360"/>
       </w:pPr>
     </w:lvl>
-    <w:lvl xmlns:w="http://schemas.openxmlformats.org/wordprocessingml/2006/main" w:ilvl="1">
+    <w:lvl w:ilvl="1" w:tplc="2ED85FDA">
       <w:start w:val="1"/>
       <w:numFmt w:val="lowerLetter"/>
       <w:lvlText w:val="%2."/>
@@ -4208,7 +4307,7 @@
         <w:ind w:left="1440" w:hanging="360"/>
       </w:pPr>
     </w:lvl>
-    <w:lvl xmlns:w="http://schemas.openxmlformats.org/wordprocessingml/2006/main" w:ilvl="2">
+    <w:lvl w:ilvl="2" w:tplc="C58896EA">
       <w:start w:val="1"/>
       <w:numFmt w:val="lowerRoman"/>
       <w:lvlText w:val="%3."/>
@@ -4217,7 +4316,7 @@
         <w:ind w:left="2160" w:hanging="180"/>
       </w:pPr>
     </w:lvl>
-    <w:lvl xmlns:w="http://schemas.openxmlformats.org/wordprocessingml/2006/main" w:ilvl="3">
+    <w:lvl w:ilvl="3" w:tplc="1CAE88A6">
       <w:start w:val="1"/>
       <w:numFmt w:val="decimal"/>
       <w:lvlText w:val="%4."/>
@@ -4226,7 +4325,7 @@
         <w:ind w:left="2880" w:hanging="360"/>
       </w:pPr>
     </w:lvl>
-    <w:lvl xmlns:w="http://schemas.openxmlformats.org/wordprocessingml/2006/main" w:ilvl="4">
+    <w:lvl w:ilvl="4" w:tplc="CAD60460">
       <w:start w:val="1"/>
       <w:numFmt w:val="lowerLetter"/>
       <w:lvlText w:val="%5."/>
@@ -4235,7 +4334,7 @@
         <w:ind w:left="3600" w:hanging="360"/>
       </w:pPr>
     </w:lvl>
-    <w:lvl xmlns:w="http://schemas.openxmlformats.org/wordprocessingml/2006/main" w:ilvl="5">
+    <w:lvl w:ilvl="5" w:tplc="2CBEF332">
       <w:start w:val="1"/>
       <w:numFmt w:val="lowerRoman"/>
       <w:lvlText w:val="%6."/>
@@ -4244,7 +4343,7 @@
         <w:ind w:left="4320" w:hanging="180"/>
       </w:pPr>
     </w:lvl>
-    <w:lvl xmlns:w="http://schemas.openxmlformats.org/wordprocessingml/2006/main" w:ilvl="6">
+    <w:lvl w:ilvl="6" w:tplc="4F3C3DBC">
       <w:start w:val="1"/>
       <w:numFmt w:val="decimal"/>
       <w:lvlText w:val="%7."/>
@@ -4253,7 +4352,7 @@
         <w:ind w:left="5040" w:hanging="360"/>
       </w:pPr>
     </w:lvl>
-    <w:lvl xmlns:w="http://schemas.openxmlformats.org/wordprocessingml/2006/main" w:ilvl="7">
+    <w:lvl w:ilvl="7" w:tplc="DAEE5684">
       <w:start w:val="1"/>
       <w:numFmt w:val="lowerLetter"/>
       <w:lvlText w:val="%8."/>
@@ -4262,7 +4361,96 @@
         <w:ind w:left="5760" w:hanging="360"/>
       </w:pPr>
     </w:lvl>
-    <w:lvl xmlns:w="http://schemas.openxmlformats.org/wordprocessingml/2006/main" w:ilvl="8">
+    <w:lvl w:ilvl="8" w:tplc="684E0776">
+      <w:start w:val="1"/>
+      <w:numFmt w:val="lowerRoman"/>
+      <w:lvlText w:val="%9."/>
+      <w:lvlJc w:val="right"/>
+      <w:pPr>
+        <w:ind w:left="6480" w:hanging="180"/>
+      </w:pPr>
+    </w:lvl>
+  </w:abstractNum>
+  <w:abstractNum w:abstractNumId="1" w15:restartNumberingAfterBreak="0">
+    <w:nsid w:val="608E6D09"/>
+    <w:multiLevelType w:val="hybridMultilevel"/>
+    <w:tmpl w:val="3E26A95C"/>
+    <w:lvl w:ilvl="0" w:tplc="0416000F">
+      <w:start w:val="1"/>
+      <w:numFmt w:val="decimal"/>
+      <w:lvlText w:val="%1."/>
+      <w:lvlJc w:val="left"/>
+      <w:pPr>
+        <w:ind w:left="720" w:hanging="360"/>
+      </w:pPr>
+      <w:rPr>
+        <w:rFonts w:hint="default"/>
+      </w:rPr>
+    </w:lvl>
+    <w:lvl w:ilvl="1" w:tplc="04160019" w:tentative="1">
+      <w:start w:val="1"/>
+      <w:numFmt w:val="lowerLetter"/>
+      <w:lvlText w:val="%2."/>
+      <w:lvlJc w:val="left"/>
+      <w:pPr>
+        <w:ind w:left="1440" w:hanging="360"/>
+      </w:pPr>
+    </w:lvl>
+    <w:lvl w:ilvl="2" w:tplc="0416001B" w:tentative="1">
+      <w:start w:val="1"/>
+      <w:numFmt w:val="lowerRoman"/>
+      <w:lvlText w:val="%3."/>
+      <w:lvlJc w:val="right"/>
+      <w:pPr>
+        <w:ind w:left="2160" w:hanging="180"/>
+      </w:pPr>
+    </w:lvl>
+    <w:lvl w:ilvl="3" w:tplc="0416000F" w:tentative="1">
+      <w:start w:val="1"/>
+      <w:numFmt w:val="decimal"/>
+      <w:lvlText w:val="%4."/>
+      <w:lvlJc w:val="left"/>
+      <w:pPr>
+        <w:ind w:left="2880" w:hanging="360"/>
+      </w:pPr>
+    </w:lvl>
+    <w:lvl w:ilvl="4" w:tplc="04160019" w:tentative="1">
+      <w:start w:val="1"/>
+      <w:numFmt w:val="lowerLetter"/>
+      <w:lvlText w:val="%5."/>
+      <w:lvlJc w:val="left"/>
+      <w:pPr>
+        <w:ind w:left="3600" w:hanging="360"/>
+      </w:pPr>
+    </w:lvl>
+    <w:lvl w:ilvl="5" w:tplc="0416001B" w:tentative="1">
+      <w:start w:val="1"/>
+      <w:numFmt w:val="lowerRoman"/>
+      <w:lvlText w:val="%6."/>
+      <w:lvlJc w:val="right"/>
+      <w:pPr>
+        <w:ind w:left="4320" w:hanging="180"/>
+      </w:pPr>
+    </w:lvl>
+    <w:lvl w:ilvl="6" w:tplc="0416000F" w:tentative="1">
+      <w:start w:val="1"/>
+      <w:numFmt w:val="decimal"/>
+      <w:lvlText w:val="%7."/>
+      <w:lvlJc w:val="left"/>
+      <w:pPr>
+        <w:ind w:left="5040" w:hanging="360"/>
+      </w:pPr>
+    </w:lvl>
+    <w:lvl w:ilvl="7" w:tplc="04160019" w:tentative="1">
+      <w:start w:val="1"/>
+      <w:numFmt w:val="lowerLetter"/>
+      <w:lvlText w:val="%8."/>
+      <w:lvlJc w:val="left"/>
+      <w:pPr>
+        <w:ind w:left="5760" w:hanging="360"/>
+      </w:pPr>
+    </w:lvl>
+    <w:lvl w:ilvl="8" w:tplc="0416001B" w:tentative="1">
       <w:start w:val="1"/>
       <w:numFmt w:val="lowerRoman"/>
       <w:lvlText w:val="%9."/>
@@ -4273,17 +4461,20 @@
     </w:lvl>
   </w:abstractNum>
   <w:num w:numId="1">
+    <w:abstractNumId w:val="0"/>
+  </w:num>
+  <w:num w:numId="2">
     <w:abstractNumId w:val="1"/>
   </w:num>
 </w:numbering>
 </file>
 
 <file path=word/styles.xml><?xml version="1.0" encoding="utf-8"?>
-<w:styles xmlns:wp14="http://schemas.microsoft.com/office/word/2010/wordprocessingDrawing" xmlns:mc="http://schemas.openxmlformats.org/markup-compatibility/2006" xmlns:r="http://schemas.openxmlformats.org/officeDocument/2006/relationships" xmlns:w="http://schemas.openxmlformats.org/wordprocessingml/2006/main" xmlns:w14="http://schemas.microsoft.com/office/word/2010/wordml" xmlns:w15="http://schemas.microsoft.com/office/word/2012/wordml" xmlns:w16cid="http://schemas.microsoft.com/office/word/2016/wordml/cid" xmlns:w16se="http://schemas.microsoft.com/office/word/2015/wordml/symex" mc:Ignorable="w14 w15 w16se w16cid wp14">
+<w:styles xmlns:mc="http://schemas.openxmlformats.org/markup-compatibility/2006" xmlns:r="http://schemas.openxmlformats.org/officeDocument/2006/relationships" xmlns:w="http://schemas.openxmlformats.org/wordprocessingml/2006/main" xmlns:w14="http://schemas.microsoft.com/office/word/2010/wordml" xmlns:w15="http://schemas.microsoft.com/office/word/2012/wordml" xmlns:w16cex="http://schemas.microsoft.com/office/word/2018/wordml/cex" xmlns:w16cid="http://schemas.microsoft.com/office/word/2016/wordml/cid" xmlns:w16="http://schemas.microsoft.com/office/word/2018/wordml" xmlns:w16sdtdh="http://schemas.microsoft.com/office/word/2020/wordml/sdtdatahash" xmlns:w16se="http://schemas.microsoft.com/office/word/2015/wordml/symex" mc:Ignorable="w14 w15 w16se w16cid w16 w16cex w16sdtdh">
   <w:docDefaults>
     <w:rPrDefault>
       <w:rPr>
-        <w:rFonts w:asciiTheme="minorHAnsi" w:hAnsiTheme="minorHAnsi" w:eastAsiaTheme="minorHAnsi" w:cstheme="minorBidi"/>
+        <w:rFonts w:asciiTheme="minorHAnsi" w:eastAsiaTheme="minorHAnsi" w:hAnsiTheme="minorHAnsi" w:cstheme="minorBidi"/>
         <w:sz w:val="22"/>
         <w:szCs w:val="22"/>
         <w:lang w:val="pt-BR" w:eastAsia="en-US" w:bidi="ar-SA"/>
@@ -4295,17 +4486,17 @@
       </w:pPr>
     </w:pPrDefault>
   </w:docDefaults>
-  <w:latentStyles w:defLockedState="0" w:defUIPriority="99" w:defSemiHidden="0" w:defUnhideWhenUsed="0" w:defQFormat="0" w:count="375">
+  <w:latentStyles w:defLockedState="0" w:defUIPriority="99" w:defSemiHidden="0" w:defUnhideWhenUsed="0" w:defQFormat="0" w:count="376">
     <w:lsdException w:name="Normal" w:uiPriority="0" w:qFormat="1"/>
     <w:lsdException w:name="heading 1" w:uiPriority="9" w:qFormat="1"/>
-    <w:lsdException w:name="heading 2" w:uiPriority="9" w:semiHidden="1" w:unhideWhenUsed="1" w:qFormat="1"/>
-    <w:lsdException w:name="heading 3" w:uiPriority="9" w:semiHidden="1" w:unhideWhenUsed="1" w:qFormat="1"/>
-    <w:lsdException w:name="heading 4" w:uiPriority="9" w:semiHidden="1" w:unhideWhenUsed="1" w:qFormat="1"/>
-    <w:lsdException w:name="heading 5" w:uiPriority="9" w:semiHidden="1" w:unhideWhenUsed="1" w:qFormat="1"/>
-    <w:lsdException w:name="heading 6" w:uiPriority="9" w:semiHidden="1" w:unhideWhenUsed="1" w:qFormat="1"/>
-    <w:lsdException w:name="heading 7" w:uiPriority="9" w:semiHidden="1" w:unhideWhenUsed="1" w:qFormat="1"/>
-    <w:lsdException w:name="heading 8" w:uiPriority="9" w:semiHidden="1" w:unhideWhenUsed="1" w:qFormat="1"/>
-    <w:lsdException w:name="heading 9" w:uiPriority="9" w:semiHidden="1" w:unhideWhenUsed="1" w:qFormat="1"/>
+    <w:lsdException w:name="heading 2" w:semiHidden="1" w:uiPriority="9" w:unhideWhenUsed="1" w:qFormat="1"/>
+    <w:lsdException w:name="heading 3" w:semiHidden="1" w:uiPriority="9" w:unhideWhenUsed="1" w:qFormat="1"/>
+    <w:lsdException w:name="heading 4" w:semiHidden="1" w:uiPriority="9" w:unhideWhenUsed="1" w:qFormat="1"/>
+    <w:lsdException w:name="heading 5" w:semiHidden="1" w:uiPriority="9" w:unhideWhenUsed="1" w:qFormat="1"/>
+    <w:lsdException w:name="heading 6" w:semiHidden="1" w:uiPriority="9" w:unhideWhenUsed="1" w:qFormat="1"/>
+    <w:lsdException w:name="heading 7" w:semiHidden="1" w:uiPriority="9" w:unhideWhenUsed="1" w:qFormat="1"/>
+    <w:lsdException w:name="heading 8" w:semiHidden="1" w:uiPriority="9" w:unhideWhenUsed="1" w:qFormat="1"/>
+    <w:lsdException w:name="heading 9" w:semiHidden="1" w:uiPriority="9" w:unhideWhenUsed="1" w:qFormat="1"/>
     <w:lsdException w:name="index 1" w:semiHidden="1" w:unhideWhenUsed="1"/>
     <w:lsdException w:name="index 2" w:semiHidden="1" w:unhideWhenUsed="1"/>
     <w:lsdException w:name="index 3" w:semiHidden="1" w:unhideWhenUsed="1"/>
@@ -4315,22 +4506,22 @@
     <w:lsdException w:name="index 7" w:semiHidden="1" w:unhideWhenUsed="1"/>
     <w:lsdException w:name="index 8" w:semiHidden="1" w:unhideWhenUsed="1"/>
     <w:lsdException w:name="index 9" w:semiHidden="1" w:unhideWhenUsed="1"/>
-    <w:lsdException w:name="toc 1" w:uiPriority="39" w:semiHidden="1" w:unhideWhenUsed="1"/>
-    <w:lsdException w:name="toc 2" w:uiPriority="39" w:semiHidden="1" w:unhideWhenUsed="1"/>
-    <w:lsdException w:name="toc 3" w:uiPriority="39" w:semiHidden="1" w:unhideWhenUsed="1"/>
-    <w:lsdException w:name="toc 4" w:uiPriority="39" w:semiHidden="1" w:unhideWhenUsed="1"/>
-    <w:lsdException w:name="toc 5" w:uiPriority="39" w:semiHidden="1" w:unhideWhenUsed="1"/>
-    <w:lsdException w:name="toc 6" w:uiPriority="39" w:semiHidden="1" w:unhideWhenUsed="1"/>
-    <w:lsdException w:name="toc 7" w:uiPriority="39" w:semiHidden="1" w:unhideWhenUsed="1"/>
-    <w:lsdException w:name="toc 8" w:uiPriority="39" w:semiHidden="1" w:unhideWhenUsed="1"/>
-    <w:lsdException w:name="toc 9" w:uiPriority="39" w:semiHidden="1" w:unhideWhenUsed="1"/>
+    <w:lsdException w:name="toc 1" w:semiHidden="1" w:uiPriority="39" w:unhideWhenUsed="1"/>
+    <w:lsdException w:name="toc 2" w:semiHidden="1" w:uiPriority="39" w:unhideWhenUsed="1"/>
+    <w:lsdException w:name="toc 3" w:semiHidden="1" w:uiPriority="39" w:unhideWhenUsed="1"/>
+    <w:lsdException w:name="toc 4" w:semiHidden="1" w:uiPriority="39" w:unhideWhenUsed="1"/>
+    <w:lsdException w:name="toc 5" w:semiHidden="1" w:uiPriority="39" w:unhideWhenUsed="1"/>
+    <w:lsdException w:name="toc 6" w:semiHidden="1" w:uiPriority="39" w:unhideWhenUsed="1"/>
+    <w:lsdException w:name="toc 7" w:semiHidden="1" w:uiPriority="39" w:unhideWhenUsed="1"/>
+    <w:lsdException w:name="toc 8" w:semiHidden="1" w:uiPriority="39" w:unhideWhenUsed="1"/>
+    <w:lsdException w:name="toc 9" w:semiHidden="1" w:uiPriority="39" w:unhideWhenUsed="1"/>
     <w:lsdException w:name="Normal Indent" w:semiHidden="1" w:unhideWhenUsed="1"/>
     <w:lsdException w:name="footnote text" w:semiHidden="1" w:unhideWhenUsed="1"/>
     <w:lsdException w:name="annotation text" w:semiHidden="1" w:unhideWhenUsed="1"/>
     <w:lsdException w:name="header" w:semiHidden="1" w:unhideWhenUsed="1"/>
     <w:lsdException w:name="footer" w:semiHidden="1" w:unhideWhenUsed="1"/>
     <w:lsdException w:name="index heading" w:semiHidden="1" w:unhideWhenUsed="1"/>
-    <w:lsdException w:name="caption" w:uiPriority="35" w:semiHidden="1" w:unhideWhenUsed="1" w:qFormat="1"/>
+    <w:lsdException w:name="caption" w:semiHidden="1" w:uiPriority="35" w:unhideWhenUsed="1" w:qFormat="1"/>
     <w:lsdException w:name="table of figures" w:semiHidden="1" w:unhideWhenUsed="1"/>
     <w:lsdException w:name="envelope address" w:semiHidden="1" w:unhideWhenUsed="1"/>
     <w:lsdException w:name="envelope return" w:semiHidden="1" w:unhideWhenUsed="1"/>
@@ -4361,7 +4552,7 @@
     <w:lsdException w:name="Title" w:uiPriority="10" w:qFormat="1"/>
     <w:lsdException w:name="Closing" w:semiHidden="1" w:unhideWhenUsed="1"/>
     <w:lsdException w:name="Signature" w:semiHidden="1" w:unhideWhenUsed="1"/>
-    <w:lsdException w:name="Default Paragraph Font" w:uiPriority="1" w:semiHidden="1" w:unhideWhenUsed="1"/>
+    <w:lsdException w:name="Default Paragraph Font" w:semiHidden="1" w:uiPriority="1" w:unhideWhenUsed="1"/>
     <w:lsdException w:name="Body Text" w:semiHidden="1" w:unhideWhenUsed="1"/>
     <w:lsdException w:name="Body Text Indent" w:semiHidden="1" w:unhideWhenUsed="1"/>
     <w:lsdException w:name="List Continue" w:semiHidden="1" w:unhideWhenUsed="1"/>
@@ -4401,7 +4592,6 @@
     <w:lsdException w:name="HTML Sample" w:semiHidden="1" w:unhideWhenUsed="1"/>
     <w:lsdException w:name="HTML Typewriter" w:semiHidden="1" w:unhideWhenUsed="1"/>
     <w:lsdException w:name="HTML Variable" w:semiHidden="1" w:unhideWhenUsed="1"/>
-    <w:lsdException w:name="Normal Table" w:semiHidden="1" w:unhideWhenUsed="1"/>
     <w:lsdException w:name="annotation subject" w:semiHidden="1" w:unhideWhenUsed="1"/>
     <w:lsdException w:name="No List" w:semiHidden="1" w:unhideWhenUsed="1"/>
     <w:lsdException w:name="Outline List 1" w:semiHidden="1" w:unhideWhenUsed="1"/>
@@ -4448,10 +4638,8 @@
     <w:lsdException w:name="Table Subtle 2" w:semiHidden="1" w:unhideWhenUsed="1"/>
     <w:lsdException w:name="Table Web 1" w:semiHidden="1" w:unhideWhenUsed="1"/>
     <w:lsdException w:name="Table Web 2" w:semiHidden="1" w:unhideWhenUsed="1"/>
-    <w:lsdException w:name="Table Web 3" w:semiHidden="1" w:unhideWhenUsed="1"/>
     <w:lsdException w:name="Balloon Text" w:semiHidden="1" w:unhideWhenUsed="1"/>
     <w:lsdException w:name="Table Grid" w:uiPriority="39"/>
-    <w:lsdException w:name="Table Theme" w:semiHidden="1" w:unhideWhenUsed="1"/>
     <w:lsdException w:name="Placeholder Text" w:semiHidden="1"/>
     <w:lsdException w:name="No Spacing" w:uiPriority="1" w:qFormat="1"/>
     <w:lsdException w:name="Light Shading" w:uiPriority="60"/>
@@ -4561,8 +4749,8 @@
     <w:lsdException w:name="Subtle Reference" w:uiPriority="31" w:qFormat="1"/>
     <w:lsdException w:name="Intense Reference" w:uiPriority="32" w:qFormat="1"/>
     <w:lsdException w:name="Book Title" w:uiPriority="33" w:qFormat="1"/>
-    <w:lsdException w:name="Bibliography" w:uiPriority="37" w:semiHidden="1" w:unhideWhenUsed="1"/>
-    <w:lsdException w:name="TOC Heading" w:uiPriority="39" w:semiHidden="1" w:unhideWhenUsed="1" w:qFormat="1"/>
+    <w:lsdException w:name="Bibliography" w:semiHidden="1" w:uiPriority="37" w:unhideWhenUsed="1"/>
+    <w:lsdException w:name="TOC Heading" w:semiHidden="1" w:uiPriority="39" w:unhideWhenUsed="1" w:qFormat="1"/>
     <w:lsdException w:name="Plain Table 1" w:uiPriority="41"/>
     <w:lsdException w:name="Plain Table 2" w:uiPriority="42"/>
     <w:lsdException w:name="Plain Table 3" w:uiPriority="43"/>
@@ -4671,18 +4859,19 @@
     <w:lsdException w:name="Smart Hyperlink" w:semiHidden="1" w:unhideWhenUsed="1"/>
     <w:lsdException w:name="Hashtag" w:semiHidden="1" w:unhideWhenUsed="1"/>
     <w:lsdException w:name="Unresolved Mention" w:semiHidden="1" w:unhideWhenUsed="1"/>
+    <w:lsdException w:name="Smart Link" w:semiHidden="1" w:unhideWhenUsed="1"/>
   </w:latentStyles>
-  <w:style w:type="paragraph" w:styleId="Normal" w:default="1">
+  <w:style w:type="paragraph" w:default="1" w:styleId="Normal">
     <w:name w:val="Normal"/>
     <w:qFormat/>
   </w:style>
-  <w:style w:type="character" w:styleId="Fontepargpadro" w:default="1">
+  <w:style w:type="character" w:default="1" w:styleId="Fontepargpadro">
     <w:name w:val="Default Paragraph Font"/>
     <w:uiPriority w:val="1"/>
     <w:semiHidden/>
     <w:unhideWhenUsed/>
   </w:style>
-  <w:style w:type="table" w:styleId="Tabelanormal" w:default="1">
+  <w:style w:type="table" w:default="1" w:styleId="Tabelanormal">
     <w:name w:val="Normal Table"/>
     <w:uiPriority w:val="99"/>
     <w:semiHidden/>
@@ -4697,7 +4886,7 @@
       </w:tblCellMar>
     </w:tblPr>
   </w:style>
-  <w:style w:type="numbering" w:styleId="Semlista" w:default="1">
+  <w:style w:type="numbering" w:default="1" w:styleId="Semlista">
     <w:name w:val="No List"/>
     <w:uiPriority w:val="99"/>
     <w:semiHidden/>
@@ -4713,12 +4902,12 @@
     </w:pPr>
     <w:tblPr>
       <w:tblBorders>
-        <w:top w:val="single" w:color="auto" w:sz="4" w:space="0"/>
-        <w:left w:val="single" w:color="auto" w:sz="4" w:space="0"/>
-        <w:bottom w:val="single" w:color="auto" w:sz="4" w:space="0"/>
-        <w:right w:val="single" w:color="auto" w:sz="4" w:space="0"/>
-        <w:insideH w:val="single" w:color="auto" w:sz="4" w:space="0"/>
-        <w:insideV w:val="single" w:color="auto" w:sz="4" w:space="0"/>
+        <w:top w:val="single" w:sz="4" w:space="0" w:color="auto"/>
+        <w:left w:val="single" w:sz="4" w:space="0" w:color="auto"/>
+        <w:bottom w:val="single" w:sz="4" w:space="0" w:color="auto"/>
+        <w:right w:val="single" w:sz="4" w:space="0" w:color="auto"/>
+        <w:insideH w:val="single" w:sz="4" w:space="0" w:color="auto"/>
+        <w:insideV w:val="single" w:sz="4" w:space="0" w:color="auto"/>
       </w:tblBorders>
     </w:tblPr>
   </w:style>
@@ -4737,7 +4926,7 @@
       <w:spacing w:after="0" w:line="240" w:lineRule="auto"/>
     </w:pPr>
   </w:style>
-  <w:style w:type="character" w:styleId="CabealhoChar" w:customStyle="1">
+  <w:style w:type="character" w:customStyle="1" w:styleId="CabealhoChar">
     <w:name w:val="Cabeçalho Char"/>
     <w:basedOn w:val="Fontepargpadro"/>
     <w:link w:val="Cabealho"/>
@@ -4759,21 +4948,20 @@
       <w:spacing w:after="0" w:line="240" w:lineRule="auto"/>
     </w:pPr>
   </w:style>
-  <w:style w:type="character" w:styleId="RodapChar" w:customStyle="1">
+  <w:style w:type="character" w:customStyle="1" w:styleId="RodapChar">
     <w:name w:val="Rodapé Char"/>
     <w:basedOn w:val="Fontepargpadro"/>
     <w:link w:val="Rodap"/>
     <w:uiPriority w:val="99"/>
     <w:rsid w:val="00FD2599"/>
   </w:style>
-  <w:style w:type="paragraph" w:styleId="ListParagraph">
-    <w:uiPriority w:val="34"/>
+  <w:style w:type="paragraph" w:styleId="PargrafodaLista">
     <w:name w:val="List Paragraph"/>
     <w:basedOn w:val="Normal"/>
+    <w:uiPriority w:val="34"/>
     <w:qFormat/>
     <w:rsid w:val="7E75360C"/>
     <w:pPr>
-      <w:spacing/>
       <w:ind w:left="720"/>
       <w:contextualSpacing/>
     </w:pPr>
@@ -4782,7 +4970,7 @@
 </file>
 
 <file path=word/theme/theme1.xml><?xml version="1.0" encoding="utf-8"?>
-<a:theme xmlns:a="http://schemas.openxmlformats.org/drawingml/2006/main" xmlns:thm15="http://schemas.microsoft.com/office/thememl/2012/main" name="Tema do Office">
+<a:theme xmlns:a="http://schemas.openxmlformats.org/drawingml/2006/main" name="Tema do Office">
   <a:themeElements>
     <a:clrScheme name="Office">
       <a:dk1>

</xml_diff>